<commit_message>
docs(presentation): anexo de capturas de pantalla de alta resolucion de todos los modulos de core-humanis
</commit_message>
<xml_diff>
--- a/core-humanis-app/documentation/Presentacion_Gerencial_Flujos_Core_Humanis.docx
+++ b/core-humanis-app/documentation/Presentacion_Gerencial_Flujos_Core_Humanis.docx
@@ -5037,6 +5037,2530 @@
           <w:szCs w:val="21"/>
         </w:rPr>
         <w:t xml:space="preserve">La Gerencia dispone ahora de información centralizada, actualizada al minuto y disponible para la toma de decisiones presupuestarias, salariales y operativas.</w:t>
+      </w:r>
+    </w:p>
+    <w:p>
+      <w:pPr>
+        <w:pageBreakBefore/>
+      </w:pPr>
+    </w:p>
+    <w:p>
+      <w:pPr>
+        <w:pStyle w:val="Heading1"/>
+        <w:spacing w:after="180" w:before="360"/>
+        <w:rPr>
+          <w:rFonts w:ascii="Calibri" w:cs="Calibri" w:eastAsia="Calibri" w:hAnsi="Calibri"/>
+          <w:b/>
+          <w:bCs/>
+          <w:color w:val="0C2340"/>
+          <w:sz w:val="32"/>
+          <w:szCs w:val="32"/>
+        </w:rPr>
+      </w:pPr>
+      <w:r>
+        <w:t xml:space="preserve">10. Anexos: Catálogo Visual de Pantallas del Sistema Core-Humanis</w:t>
+      </w:r>
+    </w:p>
+    <w:p>
+      <w:pPr>
+        <w:spacing w:after="100" w:before="60" w:line="276"/>
+        <w:jc w:val="both"/>
+      </w:pPr>
+      <w:r>
+        <w:rPr>
+          <w:rFonts w:ascii="Calibri" w:cs="Calibri" w:eastAsia="Calibri" w:hAnsi="Calibri"/>
+          <w:b w:val="false"/>
+          <w:bCs w:val="false"/>
+          <w:i w:val="false"/>
+          <w:iCs w:val="false"/>
+          <w:color w:val="1E293B"/>
+          <w:sz w:val="21"/>
+          <w:szCs w:val="21"/>
+        </w:rPr>
+        <w:t xml:space="preserve">A continuación se integran las capturas de pantalla de la interfaz de usuario de cada uno de los trece (13) submódulos que componen el ecosistema Core-Humanis. Estas imágenes corresponden al sistema en ejecución activa en la Secretaría de Comunicación Social de la Presidencia (SCSPR), demostrando la solidez funcional, usabilidad y rigor estético implementado:</w:t>
+      </w:r>
+    </w:p>
+    <w:p>
+      <w:pPr>
+        <w:pStyle w:val="Heading2"/>
+        <w:spacing w:after="120" w:before="240"/>
+        <w:rPr>
+          <w:rFonts w:ascii="Calibri" w:cs="Calibri" w:eastAsia="Calibri" w:hAnsi="Calibri"/>
+          <w:b/>
+          <w:bCs/>
+          <w:color w:val="1E3A8A"/>
+          <w:sz w:val="26"/>
+          <w:szCs w:val="26"/>
+        </w:rPr>
+      </w:pPr>
+      <w:r>
+        <w:t xml:space="preserve">Anexo 1: Directorio Institucional de Personal (Listado Maestro)</w:t>
+      </w:r>
+    </w:p>
+    <w:p>
+      <w:pPr>
+        <w:spacing w:after="100" w:before="60" w:line="276"/>
+        <w:jc w:val="both"/>
+      </w:pPr>
+      <w:r>
+        <w:rPr>
+          <w:rFonts w:ascii="Calibri" w:cs="Calibri" w:eastAsia="Calibri" w:hAnsi="Calibri"/>
+          <w:b w:val="false"/>
+          <w:bCs w:val="false"/>
+          <w:i w:val="false"/>
+          <w:iCs w:val="false"/>
+          <w:color w:val="1E293B"/>
+          <w:sz w:val="21"/>
+          <w:szCs w:val="21"/>
+        </w:rPr>
+        <w:t xml:space="preserve">Vista general y punto de partida de la administración de recursos humanos, con filtros inmediatos por renglón presupuestario (011, 021, 022, 029, 18), alertas de semáforo de vigencia y acceso directo a Ficha 360°.</w:t>
+      </w:r>
+    </w:p>
+    <w:p>
+      <w:pPr>
+        <w:spacing w:after="60" w:before="200"/>
+        <w:jc w:val="center"/>
+      </w:pPr>
+      <w:r>
+        <w:drawing>
+          <wp:inline distT="0" distB="0" distL="0" distR="0">
+            <wp:extent cx="5334000" cy="3333750"/>
+            <wp:effectExtent t="0" r="0" b="0" l="0"/>
+            <wp:docPr id="7" name="" descr="" title=""/>
+            <wp:cNvGraphicFramePr>
+              <a:graphicFrameLocks xmlns:a="http://schemas.openxmlformats.org/drawingml/2006/main" noChangeAspect="1"/>
+            </wp:cNvGraphicFramePr>
+            <a:graphic xmlns:a="http://schemas.openxmlformats.org/drawingml/2006/main">
+              <a:graphicData uri="http://schemas.openxmlformats.org/drawingml/2006/picture">
+                <pic:pic xmlns:pic="http://schemas.openxmlformats.org/drawingml/2006/picture">
+                  <pic:nvPicPr>
+                    <pic:cNvPr id="0" name="" descr=""/>
+                    <pic:cNvPicPr>
+                      <a:picLocks noChangeAspect="1" noChangeArrowheads="1"/>
+                    </pic:cNvPicPr>
+                  </pic:nvPicPr>
+                  <pic:blipFill>
+                    <a:blip r:embed="rId15" cstate="none"/>
+                    <a:srcRect/>
+                    <a:stretch>
+                      <a:fillRect/>
+                    </a:stretch>
+                  </pic:blipFill>
+                  <pic:spPr bwMode="auto">
+                    <a:xfrm>
+                      <a:off x="0" y="0"/>
+                      <a:ext cx="5334000" cy="3333750"/>
+                    </a:xfrm>
+                    <a:prstGeom prst="rect">
+                      <a:avLst/>
+                    </a:prstGeom>
+                  </pic:spPr>
+                </pic:pic>
+              </a:graphicData>
+            </a:graphic>
+          </wp:inline>
+        </w:drawing>
+      </w:r>
+    </w:p>
+    <w:p>
+      <w:pPr>
+        <w:spacing w:after="120" w:before="40"/>
+        <w:jc w:val="center"/>
+      </w:pPr>
+      <w:r>
+        <w:rPr>
+          <w:rFonts w:ascii="Calibri" w:cs="Calibri" w:eastAsia="Calibri" w:hAnsi="Calibri"/>
+          <w:b/>
+          <w:bCs/>
+          <w:i/>
+          <w:iCs/>
+          <w:color w:val="475569"/>
+          <w:sz w:val="18"/>
+          <w:szCs w:val="18"/>
+        </w:rPr>
+        <w:t xml:space="preserve">Captura de Pantalla: Directorio Institucional de Personal — Búsqueda, Filtros de Renglón y Semáforos de Vigencia</w:t>
+      </w:r>
+    </w:p>
+    <w:p>
+      <w:pPr>
+        <w:pStyle w:val="ListParagraph"/>
+        <w:numPr>
+          <w:ilvl w:val="0"/>
+          <w:numId w:val="1"/>
+        </w:numPr>
+        <w:spacing w:after="60" w:before="40" w:line="260"/>
+      </w:pPr>
+      <w:r>
+        <w:rPr>
+          <w:rFonts w:ascii="Calibri" w:cs="Calibri" w:eastAsia="Calibri" w:hAnsi="Calibri"/>
+          <w:b/>
+          <w:bCs/>
+          <w:color w:val="0C2340"/>
+          <w:sz w:val="21"/>
+          <w:szCs w:val="21"/>
+        </w:rPr>
+        <w:t xml:space="preserve">Métricas en Tiempo Real: </w:t>
+      </w:r>
+      <w:r>
+        <w:rPr>
+          <w:rFonts w:ascii="Calibri" w:cs="Calibri" w:eastAsia="Calibri" w:hAnsi="Calibri"/>
+          <w:color w:val="1E293B"/>
+          <w:sz w:val="21"/>
+          <w:szCs w:val="21"/>
+        </w:rPr>
+        <w:t xml:space="preserve">Tarjetas resumen con conteo de expedientes activos y distribución por planilla permanente y contratos de servicios.</w:t>
+      </w:r>
+    </w:p>
+    <w:p>
+      <w:pPr>
+        <w:pStyle w:val="ListParagraph"/>
+        <w:numPr>
+          <w:ilvl w:val="0"/>
+          <w:numId w:val="1"/>
+        </w:numPr>
+        <w:spacing w:after="60" w:before="40" w:line="260"/>
+      </w:pPr>
+      <w:r>
+        <w:rPr>
+          <w:rFonts w:ascii="Calibri" w:cs="Calibri" w:eastAsia="Calibri" w:hAnsi="Calibri"/>
+          <w:b/>
+          <w:bCs/>
+          <w:color w:val="0C2340"/>
+          <w:sz w:val="21"/>
+          <w:szCs w:val="21"/>
+        </w:rPr>
+        <w:t xml:space="preserve">Búsqueda Predictiva: </w:t>
+      </w:r>
+      <w:r>
+        <w:rPr>
+          <w:rFonts w:ascii="Calibri" w:cs="Calibri" w:eastAsia="Calibri" w:hAnsi="Calibri"/>
+          <w:color w:val="1E293B"/>
+          <w:sz w:val="21"/>
+          <w:szCs w:val="21"/>
+        </w:rPr>
+        <w:t xml:space="preserve">Filtrado instantáneo por Nombres, Apellidos, DPI (CUI), NIT o Puesto Funcional.</w:t>
+      </w:r>
+    </w:p>
+    <w:p>
+      <w:pPr>
+        <w:pStyle w:val="ListParagraph"/>
+        <w:numPr>
+          <w:ilvl w:val="0"/>
+          <w:numId w:val="1"/>
+        </w:numPr>
+        <w:spacing w:after="60" w:before="40" w:line="260"/>
+      </w:pPr>
+      <w:r>
+        <w:rPr>
+          <w:rFonts w:ascii="Calibri" w:cs="Calibri" w:eastAsia="Calibri" w:hAnsi="Calibri"/>
+          <w:b/>
+          <w:bCs/>
+          <w:color w:val="0C2340"/>
+          <w:sz w:val="21"/>
+          <w:szCs w:val="21"/>
+        </w:rPr>
+        <w:t xml:space="preserve">Semáforos de Expediente: </w:t>
+      </w:r>
+      <w:r>
+        <w:rPr>
+          <w:rFonts w:ascii="Calibri" w:cs="Calibri" w:eastAsia="Calibri" w:hAnsi="Calibri"/>
+          <w:color w:val="1E293B"/>
+          <w:sz w:val="21"/>
+          <w:szCs w:val="21"/>
+        </w:rPr>
+        <w:t xml:space="preserve">Indicadores visuales automáticos que alertan a los analistas sobre expedientes completos o próximos a vencer.</w:t>
+      </w:r>
+    </w:p>
+    <w:p>
+      <w:pPr>
+        <w:pStyle w:val="Heading2"/>
+        <w:spacing w:after="120" w:before="240"/>
+        <w:rPr>
+          <w:rFonts w:ascii="Calibri" w:cs="Calibri" w:eastAsia="Calibri" w:hAnsi="Calibri"/>
+          <w:b/>
+          <w:bCs/>
+          <w:color w:val="1E3A8A"/>
+          <w:sz w:val="26"/>
+          <w:szCs w:val="26"/>
+        </w:rPr>
+      </w:pPr>
+      <w:r>
+        <w:t xml:space="preserve">Anexo 2: Ficha 360° y Expediente Digital Único</w:t>
+      </w:r>
+    </w:p>
+    <w:p>
+      <w:pPr>
+        <w:spacing w:after="100" w:before="60" w:line="276"/>
+        <w:jc w:val="both"/>
+      </w:pPr>
+      <w:r>
+        <w:rPr>
+          <w:rFonts w:ascii="Calibri" w:cs="Calibri" w:eastAsia="Calibri" w:hAnsi="Calibri"/>
+          <w:b w:val="false"/>
+          <w:bCs w:val="false"/>
+          <w:i w:val="false"/>
+          <w:iCs w:val="false"/>
+          <w:color w:val="1E293B"/>
+          <w:sz w:val="21"/>
+          <w:szCs w:val="21"/>
+        </w:rPr>
+        <w:t xml:space="preserve">Ficha centralizada por colaborador con repositorio de documentos digitalizados, control estricto de semáforos de caducidad legal (CGC, antecedentes, colegiado) y herramientas de visualización interactiva y descarga directa.</w:t>
+      </w:r>
+    </w:p>
+    <w:p>
+      <w:pPr>
+        <w:spacing w:after="60" w:before="200"/>
+        <w:jc w:val="center"/>
+      </w:pPr>
+      <w:r>
+        <w:drawing>
+          <wp:inline distT="0" distB="0" distL="0" distR="0">
+            <wp:extent cx="5334000" cy="3333750"/>
+            <wp:effectExtent t="0" r="0" b="0" l="0"/>
+            <wp:docPr id="8" name="" descr="" title=""/>
+            <wp:cNvGraphicFramePr>
+              <a:graphicFrameLocks xmlns:a="http://schemas.openxmlformats.org/drawingml/2006/main" noChangeAspect="1"/>
+            </wp:cNvGraphicFramePr>
+            <a:graphic xmlns:a="http://schemas.openxmlformats.org/drawingml/2006/main">
+              <a:graphicData uri="http://schemas.openxmlformats.org/drawingml/2006/picture">
+                <pic:pic xmlns:pic="http://schemas.openxmlformats.org/drawingml/2006/picture">
+                  <pic:nvPicPr>
+                    <pic:cNvPr id="0" name="" descr=""/>
+                    <pic:cNvPicPr>
+                      <a:picLocks noChangeAspect="1" noChangeArrowheads="1"/>
+                    </pic:cNvPicPr>
+                  </pic:nvPicPr>
+                  <pic:blipFill>
+                    <a:blip r:embed="rId16" cstate="none"/>
+                    <a:srcRect/>
+                    <a:stretch>
+                      <a:fillRect/>
+                    </a:stretch>
+                  </pic:blipFill>
+                  <pic:spPr bwMode="auto">
+                    <a:xfrm>
+                      <a:off x="0" y="0"/>
+                      <a:ext cx="5334000" cy="3333750"/>
+                    </a:xfrm>
+                    <a:prstGeom prst="rect">
+                      <a:avLst/>
+                    </a:prstGeom>
+                  </pic:spPr>
+                </pic:pic>
+              </a:graphicData>
+            </a:graphic>
+          </wp:inline>
+        </w:drawing>
+      </w:r>
+    </w:p>
+    <w:p>
+      <w:pPr>
+        <w:spacing w:after="120" w:before="40"/>
+        <w:jc w:val="center"/>
+      </w:pPr>
+      <w:r>
+        <w:rPr>
+          <w:rFonts w:ascii="Calibri" w:cs="Calibri" w:eastAsia="Calibri" w:hAnsi="Calibri"/>
+          <w:b/>
+          <w:bCs/>
+          <w:i/>
+          <w:iCs/>
+          <w:color w:val="475569"/>
+          <w:sz w:val="18"/>
+          <w:szCs w:val="18"/>
+        </w:rPr>
+        <w:t xml:space="preserve">Captura de Pantalla: Ficha 360° del Colaborador — Pestaña de Expediente Digital con Visor Interactivo y Descarga</w:t>
+      </w:r>
+    </w:p>
+    <w:p>
+      <w:pPr>
+        <w:pStyle w:val="ListParagraph"/>
+        <w:numPr>
+          <w:ilvl w:val="0"/>
+          <w:numId w:val="1"/>
+        </w:numPr>
+        <w:spacing w:after="60" w:before="40" w:line="260"/>
+      </w:pPr>
+      <w:r>
+        <w:rPr>
+          <w:rFonts w:ascii="Calibri" w:cs="Calibri" w:eastAsia="Calibri" w:hAnsi="Calibri"/>
+          <w:b/>
+          <w:bCs/>
+          <w:color w:val="0C2340"/>
+          <w:sz w:val="21"/>
+          <w:szCs w:val="21"/>
+        </w:rPr>
+        <w:t xml:space="preserve">Visor Interactivo Integrado: </w:t>
+      </w:r>
+      <w:r>
+        <w:rPr>
+          <w:rFonts w:ascii="Calibri" w:cs="Calibri" w:eastAsia="Calibri" w:hAnsi="Calibri"/>
+          <w:color w:val="1E293B"/>
+          <w:sz w:val="21"/>
+          <w:szCs w:val="21"/>
+        </w:rPr>
+        <w:t xml:space="preserve">Permite previsualizar archivos PDF e imágenes de atestados dentro de la plataforma sin requerir aplicaciones externas.</w:t>
+      </w:r>
+    </w:p>
+    <w:p>
+      <w:pPr>
+        <w:pStyle w:val="ListParagraph"/>
+        <w:numPr>
+          <w:ilvl w:val="0"/>
+          <w:numId w:val="1"/>
+        </w:numPr>
+        <w:spacing w:after="60" w:before="40" w:line="260"/>
+      </w:pPr>
+      <w:r>
+        <w:rPr>
+          <w:rFonts w:ascii="Calibri" w:cs="Calibri" w:eastAsia="Calibri" w:hAnsi="Calibri"/>
+          <w:b/>
+          <w:bCs/>
+          <w:color w:val="0C2340"/>
+          <w:sz w:val="21"/>
+          <w:szCs w:val="21"/>
+        </w:rPr>
+        <w:t xml:space="preserve">Descarga Segura: </w:t>
+      </w:r>
+      <w:r>
+        <w:rPr>
+          <w:rFonts w:ascii="Calibri" w:cs="Calibri" w:eastAsia="Calibri" w:hAnsi="Calibri"/>
+          <w:color w:val="1E293B"/>
+          <w:sz w:val="21"/>
+          <w:szCs w:val="21"/>
+        </w:rPr>
+        <w:t xml:space="preserve">Streaming cifrado para descarga local de los expedientes con trazabilidad de auditoría.</w:t>
+      </w:r>
+    </w:p>
+    <w:p>
+      <w:pPr>
+        <w:pStyle w:val="ListParagraph"/>
+        <w:numPr>
+          <w:ilvl w:val="0"/>
+          <w:numId w:val="1"/>
+        </w:numPr>
+        <w:spacing w:after="60" w:before="40" w:line="260"/>
+      </w:pPr>
+      <w:r>
+        <w:rPr>
+          <w:rFonts w:ascii="Calibri" w:cs="Calibri" w:eastAsia="Calibri" w:hAnsi="Calibri"/>
+          <w:b/>
+          <w:bCs/>
+          <w:color w:val="0C2340"/>
+          <w:sz w:val="21"/>
+          <w:szCs w:val="21"/>
+        </w:rPr>
+        <w:t xml:space="preserve">Regla de Caducidad CGC (6 meses): </w:t>
+      </w:r>
+      <w:r>
+        <w:rPr>
+          <w:rFonts w:ascii="Calibri" w:cs="Calibri" w:eastAsia="Calibri" w:hAnsi="Calibri"/>
+          <w:color w:val="1E293B"/>
+          <w:sz w:val="21"/>
+          <w:szCs w:val="21"/>
+        </w:rPr>
+        <w:t xml:space="preserve">Vigilancia automática del finiquito con cálculo normativo de vencimiento.</w:t>
+      </w:r>
+    </w:p>
+    <w:p>
+      <w:pPr>
+        <w:pStyle w:val="Heading2"/>
+        <w:spacing w:after="120" w:before="240"/>
+        <w:rPr>
+          <w:rFonts w:ascii="Calibri" w:cs="Calibri" w:eastAsia="Calibri" w:hAnsi="Calibri"/>
+          <w:b/>
+          <w:bCs/>
+          <w:color w:val="1E3A8A"/>
+          <w:sz w:val="26"/>
+          <w:szCs w:val="26"/>
+        </w:rPr>
+      </w:pPr>
+      <w:r>
+        <w:t xml:space="preserve">Anexo 3: Estructura Organizacional Jerárquica e Ingesta Dinámica</w:t>
+      </w:r>
+    </w:p>
+    <w:p>
+      <w:pPr>
+        <w:spacing w:after="100" w:before="60" w:line="276"/>
+        <w:jc w:val="both"/>
+      </w:pPr>
+      <w:r>
+        <w:rPr>
+          <w:rFonts w:ascii="Calibri" w:cs="Calibri" w:eastAsia="Calibri" w:hAnsi="Calibri"/>
+          <w:b w:val="false"/>
+          <w:bCs w:val="false"/>
+          <w:i w:val="false"/>
+          <w:iCs w:val="false"/>
+          <w:color w:val="1E293B"/>
+          <w:sz w:val="21"/>
+          <w:szCs w:val="21"/>
+        </w:rPr>
+        <w:t xml:space="preserve">Representación interactiva del árbol jerárquico de la Secretaría, permitiendo visualizar dependencias, despachos, plazas asignadas y vacantes presupuestarias.</w:t>
+      </w:r>
+    </w:p>
+    <w:p>
+      <w:pPr>
+        <w:spacing w:after="60" w:before="200"/>
+        <w:jc w:val="center"/>
+      </w:pPr>
+      <w:r>
+        <w:drawing>
+          <wp:inline distT="0" distB="0" distL="0" distR="0">
+            <wp:extent cx="5334000" cy="3333750"/>
+            <wp:effectExtent t="0" r="0" b="0" l="0"/>
+            <wp:docPr id="9" name="" descr="" title=""/>
+            <wp:cNvGraphicFramePr>
+              <a:graphicFrameLocks xmlns:a="http://schemas.openxmlformats.org/drawingml/2006/main" noChangeAspect="1"/>
+            </wp:cNvGraphicFramePr>
+            <a:graphic xmlns:a="http://schemas.openxmlformats.org/drawingml/2006/main">
+              <a:graphicData uri="http://schemas.openxmlformats.org/drawingml/2006/picture">
+                <pic:pic xmlns:pic="http://schemas.openxmlformats.org/drawingml/2006/picture">
+                  <pic:nvPicPr>
+                    <pic:cNvPr id="0" name="" descr=""/>
+                    <pic:cNvPicPr>
+                      <a:picLocks noChangeAspect="1" noChangeArrowheads="1"/>
+                    </pic:cNvPicPr>
+                  </pic:nvPicPr>
+                  <pic:blipFill>
+                    <a:blip r:embed="rId17" cstate="none"/>
+                    <a:srcRect/>
+                    <a:stretch>
+                      <a:fillRect/>
+                    </a:stretch>
+                  </pic:blipFill>
+                  <pic:spPr bwMode="auto">
+                    <a:xfrm>
+                      <a:off x="0" y="0"/>
+                      <a:ext cx="5334000" cy="3333750"/>
+                    </a:xfrm>
+                    <a:prstGeom prst="rect">
+                      <a:avLst/>
+                    </a:prstGeom>
+                  </pic:spPr>
+                </pic:pic>
+              </a:graphicData>
+            </a:graphic>
+          </wp:inline>
+        </w:drawing>
+      </w:r>
+    </w:p>
+    <w:p>
+      <w:pPr>
+        <w:spacing w:after="120" w:before="40"/>
+        <w:jc w:val="center"/>
+      </w:pPr>
+      <w:r>
+        <w:rPr>
+          <w:rFonts w:ascii="Calibri" w:cs="Calibri" w:eastAsia="Calibri" w:hAnsi="Calibri"/>
+          <w:b/>
+          <w:bCs/>
+          <w:i/>
+          <w:iCs/>
+          <w:color w:val="475569"/>
+          <w:sz w:val="18"/>
+          <w:szCs w:val="18"/>
+        </w:rPr>
+        <w:t xml:space="preserve">Captura de Pantalla: Módulo de Organigramas — Árbol Jerárquico Dinámico y Detección de Plazas Vacantes</w:t>
+      </w:r>
+    </w:p>
+    <w:p>
+      <w:pPr>
+        <w:pStyle w:val="ListParagraph"/>
+        <w:numPr>
+          <w:ilvl w:val="0"/>
+          <w:numId w:val="1"/>
+        </w:numPr>
+        <w:spacing w:after="60" w:before="40" w:line="260"/>
+      </w:pPr>
+      <w:r>
+        <w:rPr>
+          <w:rFonts w:ascii="Calibri" w:cs="Calibri" w:eastAsia="Calibri" w:hAnsi="Calibri"/>
+          <w:b/>
+          <w:bCs/>
+          <w:color w:val="0C2340"/>
+          <w:sz w:val="21"/>
+          <w:szCs w:val="21"/>
+        </w:rPr>
+        <w:t xml:space="preserve">Navegación Visual: </w:t>
+      </w:r>
+      <w:r>
+        <w:rPr>
+          <w:rFonts w:ascii="Calibri" w:cs="Calibri" w:eastAsia="Calibri" w:hAnsi="Calibri"/>
+          <w:color w:val="1E293B"/>
+          <w:sz w:val="21"/>
+          <w:szCs w:val="21"/>
+        </w:rPr>
+        <w:t xml:space="preserve">Árbol multinivel desplegable con nodos institucionales y dependencias administrativas.</w:t>
+      </w:r>
+    </w:p>
+    <w:p>
+      <w:pPr>
+        <w:pStyle w:val="ListParagraph"/>
+        <w:numPr>
+          <w:ilvl w:val="0"/>
+          <w:numId w:val="1"/>
+        </w:numPr>
+        <w:spacing w:after="60" w:before="40" w:line="260"/>
+      </w:pPr>
+      <w:r>
+        <w:rPr>
+          <w:rFonts w:ascii="Calibri" w:cs="Calibri" w:eastAsia="Calibri" w:hAnsi="Calibri"/>
+          <w:b/>
+          <w:bCs/>
+          <w:color w:val="0C2340"/>
+          <w:sz w:val="21"/>
+          <w:szCs w:val="21"/>
+        </w:rPr>
+        <w:t xml:space="preserve">Carga Masiva CSV: </w:t>
+      </w:r>
+      <w:r>
+        <w:rPr>
+          <w:rFonts w:ascii="Calibri" w:cs="Calibri" w:eastAsia="Calibri" w:hAnsi="Calibri"/>
+          <w:color w:val="1E293B"/>
+          <w:sz w:val="21"/>
+          <w:szCs w:val="21"/>
+        </w:rPr>
+        <w:t xml:space="preserve">Ingesta automática de estructuras jerárquicas con validación de unidades padre.</w:t>
+      </w:r>
+    </w:p>
+    <w:p>
+      <w:pPr>
+        <w:pStyle w:val="ListParagraph"/>
+        <w:numPr>
+          <w:ilvl w:val="0"/>
+          <w:numId w:val="1"/>
+        </w:numPr>
+        <w:spacing w:after="60" w:before="40" w:line="260"/>
+      </w:pPr>
+      <w:r>
+        <w:rPr>
+          <w:rFonts w:ascii="Calibri" w:cs="Calibri" w:eastAsia="Calibri" w:hAnsi="Calibri"/>
+          <w:b/>
+          <w:bCs/>
+          <w:color w:val="0C2340"/>
+          <w:sz w:val="21"/>
+          <w:szCs w:val="21"/>
+        </w:rPr>
+        <w:t xml:space="preserve">Exportación Oficial: </w:t>
+      </w:r>
+      <w:r>
+        <w:rPr>
+          <w:rFonts w:ascii="Calibri" w:cs="Calibri" w:eastAsia="Calibri" w:hAnsi="Calibri"/>
+          <w:color w:val="1E293B"/>
+          <w:sz w:val="21"/>
+          <w:szCs w:val="21"/>
+        </w:rPr>
+        <w:t xml:space="preserve">Generación de diagramas institucionales de alta definición para presentaciones y auditorías.</w:t>
+      </w:r>
+    </w:p>
+    <w:p>
+      <w:pPr>
+        <w:pStyle w:val="Heading2"/>
+        <w:spacing w:after="120" w:before="240"/>
+        <w:rPr>
+          <w:rFonts w:ascii="Calibri" w:cs="Calibri" w:eastAsia="Calibri" w:hAnsi="Calibri"/>
+          <w:b/>
+          <w:bCs/>
+          <w:color w:val="1E3A8A"/>
+          <w:sz w:val="26"/>
+          <w:szCs w:val="26"/>
+        </w:rPr>
+      </w:pPr>
+      <w:r>
+        <w:t xml:space="preserve">Anexo 4: Flujo Asistido de Contratación de Personal (Wizard)</w:t>
+      </w:r>
+    </w:p>
+    <w:p>
+      <w:pPr>
+        <w:spacing w:after="100" w:before="60" w:line="276"/>
+        <w:jc w:val="both"/>
+      </w:pPr>
+      <w:r>
+        <w:rPr>
+          <w:rFonts w:ascii="Calibri" w:cs="Calibri" w:eastAsia="Calibri" w:hAnsi="Calibri"/>
+          <w:b w:val="false"/>
+          <w:bCs w:val="false"/>
+          <w:i w:val="false"/>
+          <w:iCs w:val="false"/>
+          <w:color w:val="1E293B"/>
+          <w:sz w:val="21"/>
+          <w:szCs w:val="21"/>
+        </w:rPr>
+        <w:t xml:space="preserve">Proceso guiado de alta de personal que asegura el cumplimiento normativo mediante pasos obligatorios de validación de identidad, asignación de puesto y formalización contractual.</w:t>
+      </w:r>
+    </w:p>
+    <w:p>
+      <w:pPr>
+        <w:spacing w:after="60" w:before="200"/>
+        <w:jc w:val="center"/>
+      </w:pPr>
+      <w:r>
+        <w:drawing>
+          <wp:inline distT="0" distB="0" distL="0" distR="0">
+            <wp:extent cx="5334000" cy="3333750"/>
+            <wp:effectExtent t="0" r="0" b="0" l="0"/>
+            <wp:docPr id="10" name="" descr="" title=""/>
+            <wp:cNvGraphicFramePr>
+              <a:graphicFrameLocks xmlns:a="http://schemas.openxmlformats.org/drawingml/2006/main" noChangeAspect="1"/>
+            </wp:cNvGraphicFramePr>
+            <a:graphic xmlns:a="http://schemas.openxmlformats.org/drawingml/2006/main">
+              <a:graphicData uri="http://schemas.openxmlformats.org/drawingml/2006/picture">
+                <pic:pic xmlns:pic="http://schemas.openxmlformats.org/drawingml/2006/picture">
+                  <pic:nvPicPr>
+                    <pic:cNvPr id="0" name="" descr=""/>
+                    <pic:cNvPicPr>
+                      <a:picLocks noChangeAspect="1" noChangeArrowheads="1"/>
+                    </pic:cNvPicPr>
+                  </pic:nvPicPr>
+                  <pic:blipFill>
+                    <a:blip r:embed="rId18" cstate="none"/>
+                    <a:srcRect/>
+                    <a:stretch>
+                      <a:fillRect/>
+                    </a:stretch>
+                  </pic:blipFill>
+                  <pic:spPr bwMode="auto">
+                    <a:xfrm>
+                      <a:off x="0" y="0"/>
+                      <a:ext cx="5334000" cy="3333750"/>
+                    </a:xfrm>
+                    <a:prstGeom prst="rect">
+                      <a:avLst/>
+                    </a:prstGeom>
+                  </pic:spPr>
+                </pic:pic>
+              </a:graphicData>
+            </a:graphic>
+          </wp:inline>
+        </w:drawing>
+      </w:r>
+    </w:p>
+    <w:p>
+      <w:pPr>
+        <w:spacing w:after="120" w:before="40"/>
+        <w:jc w:val="center"/>
+      </w:pPr>
+      <w:r>
+        <w:rPr>
+          <w:rFonts w:ascii="Calibri" w:cs="Calibri" w:eastAsia="Calibri" w:hAnsi="Calibri"/>
+          <w:b/>
+          <w:bCs/>
+          <w:i/>
+          <w:iCs/>
+          <w:color w:val="475569"/>
+          <w:sz w:val="18"/>
+          <w:szCs w:val="18"/>
+        </w:rPr>
+        <w:t xml:space="preserve">Captura de Pantalla: Módulo de Contratación — Asistente Guiado de 4 Pasos con Validación CUI</w:t>
+      </w:r>
+    </w:p>
+    <w:p>
+      <w:pPr>
+        <w:pStyle w:val="ListParagraph"/>
+        <w:numPr>
+          <w:ilvl w:val="0"/>
+          <w:numId w:val="1"/>
+        </w:numPr>
+        <w:spacing w:after="60" w:before="40" w:line="260"/>
+      </w:pPr>
+      <w:r>
+        <w:rPr>
+          <w:rFonts w:ascii="Calibri" w:cs="Calibri" w:eastAsia="Calibri" w:hAnsi="Calibri"/>
+          <w:b/>
+          <w:bCs/>
+          <w:color w:val="0C2340"/>
+          <w:sz w:val="21"/>
+          <w:szCs w:val="21"/>
+        </w:rPr>
+        <w:t xml:space="preserve">Validación Estricta de CUI/DPI: </w:t>
+      </w:r>
+      <w:r>
+        <w:rPr>
+          <w:rFonts w:ascii="Calibri" w:cs="Calibri" w:eastAsia="Calibri" w:hAnsi="Calibri"/>
+          <w:color w:val="1E293B"/>
+          <w:sz w:val="21"/>
+          <w:szCs w:val="21"/>
+        </w:rPr>
+        <w:t xml:space="preserve">Control automático contra duplicidades y fijación de código de empleado coincidente con CUI institucional.</w:t>
+      </w:r>
+    </w:p>
+    <w:p>
+      <w:pPr>
+        <w:pStyle w:val="ListParagraph"/>
+        <w:numPr>
+          <w:ilvl w:val="0"/>
+          <w:numId w:val="1"/>
+        </w:numPr>
+        <w:spacing w:after="60" w:before="40" w:line="260"/>
+      </w:pPr>
+      <w:r>
+        <w:rPr>
+          <w:rFonts w:ascii="Calibri" w:cs="Calibri" w:eastAsia="Calibri" w:hAnsi="Calibri"/>
+          <w:b/>
+          <w:bCs/>
+          <w:color w:val="0C2340"/>
+          <w:sz w:val="21"/>
+          <w:szCs w:val="21"/>
+        </w:rPr>
+        <w:t xml:space="preserve">Diferenciación de Renglones: </w:t>
+      </w:r>
+      <w:r>
+        <w:rPr>
+          <w:rFonts w:ascii="Calibri" w:cs="Calibri" w:eastAsia="Calibri" w:hAnsi="Calibri"/>
+          <w:color w:val="1E293B"/>
+          <w:sz w:val="21"/>
+          <w:szCs w:val="21"/>
+        </w:rPr>
+        <w:t xml:space="preserve">Bifurcación normativa entre relación de dependencia (011/022) y servicios técnicos/profesionales (029/18).</w:t>
+      </w:r>
+    </w:p>
+    <w:p>
+      <w:pPr>
+        <w:pStyle w:val="ListParagraph"/>
+        <w:numPr>
+          <w:ilvl w:val="0"/>
+          <w:numId w:val="1"/>
+        </w:numPr>
+        <w:spacing w:after="60" w:before="40" w:line="260"/>
+      </w:pPr>
+      <w:r>
+        <w:rPr>
+          <w:rFonts w:ascii="Calibri" w:cs="Calibri" w:eastAsia="Calibri" w:hAnsi="Calibri"/>
+          <w:b/>
+          <w:bCs/>
+          <w:color w:val="0C2340"/>
+          <w:sz w:val="21"/>
+          <w:szCs w:val="21"/>
+        </w:rPr>
+        <w:t xml:space="preserve">Pre-carga de Puestos Vacantes: </w:t>
+      </w:r>
+      <w:r>
+        <w:rPr>
+          <w:rFonts w:ascii="Calibri" w:cs="Calibri" w:eastAsia="Calibri" w:hAnsi="Calibri"/>
+          <w:color w:val="1E293B"/>
+          <w:sz w:val="21"/>
+          <w:szCs w:val="21"/>
+        </w:rPr>
+        <w:t xml:space="preserve">Asignación directa a partidas autorizadas sin sobregiro de plantilla.</w:t>
+      </w:r>
+    </w:p>
+    <w:p>
+      <w:pPr>
+        <w:pStyle w:val="Heading2"/>
+        <w:spacing w:after="120" w:before="240"/>
+        <w:rPr>
+          <w:rFonts w:ascii="Calibri" w:cs="Calibri" w:eastAsia="Calibri" w:hAnsi="Calibri"/>
+          <w:b/>
+          <w:bCs/>
+          <w:color w:val="1E3A8A"/>
+          <w:sz w:val="26"/>
+          <w:szCs w:val="26"/>
+        </w:rPr>
+      </w:pPr>
+      <w:r>
+        <w:t xml:space="preserve">Anexo 5: Emisión de Constancias Oficiales con Código QR y Firma SHA-256</w:t>
+      </w:r>
+    </w:p>
+    <w:p>
+      <w:pPr>
+        <w:spacing w:after="100" w:before="60" w:line="276"/>
+        <w:jc w:val="both"/>
+      </w:pPr>
+      <w:r>
+        <w:rPr>
+          <w:rFonts w:ascii="Calibri" w:cs="Calibri" w:eastAsia="Calibri" w:hAnsi="Calibri"/>
+          <w:b w:val="false"/>
+          <w:bCs w:val="false"/>
+          <w:i w:val="false"/>
+          <w:iCs w:val="false"/>
+          <w:color w:val="1E293B"/>
+          <w:sz w:val="21"/>
+          <w:szCs w:val="21"/>
+        </w:rPr>
+        <w:t xml:space="preserve">Generador de certificaciones laborales en formato Word (.docx) y PDF con código QR de verificación ciudadana en tiempo real y hash criptográfico institucional.</w:t>
+      </w:r>
+    </w:p>
+    <w:p>
+      <w:pPr>
+        <w:spacing w:after="60" w:before="200"/>
+        <w:jc w:val="center"/>
+      </w:pPr>
+      <w:r>
+        <w:drawing>
+          <wp:inline distT="0" distB="0" distL="0" distR="0">
+            <wp:extent cx="5334000" cy="3333750"/>
+            <wp:effectExtent t="0" r="0" b="0" l="0"/>
+            <wp:docPr id="11" name="" descr="" title=""/>
+            <wp:cNvGraphicFramePr>
+              <a:graphicFrameLocks xmlns:a="http://schemas.openxmlformats.org/drawingml/2006/main" noChangeAspect="1"/>
+            </wp:cNvGraphicFramePr>
+            <a:graphic xmlns:a="http://schemas.openxmlformats.org/drawingml/2006/main">
+              <a:graphicData uri="http://schemas.openxmlformats.org/drawingml/2006/picture">
+                <pic:pic xmlns:pic="http://schemas.openxmlformats.org/drawingml/2006/picture">
+                  <pic:nvPicPr>
+                    <pic:cNvPr id="0" name="" descr=""/>
+                    <pic:cNvPicPr>
+                      <a:picLocks noChangeAspect="1" noChangeArrowheads="1"/>
+                    </pic:cNvPicPr>
+                  </pic:nvPicPr>
+                  <pic:blipFill>
+                    <a:blip r:embed="rId19" cstate="none"/>
+                    <a:srcRect/>
+                    <a:stretch>
+                      <a:fillRect/>
+                    </a:stretch>
+                  </pic:blipFill>
+                  <pic:spPr bwMode="auto">
+                    <a:xfrm>
+                      <a:off x="0" y="0"/>
+                      <a:ext cx="5334000" cy="3333750"/>
+                    </a:xfrm>
+                    <a:prstGeom prst="rect">
+                      <a:avLst/>
+                    </a:prstGeom>
+                  </pic:spPr>
+                </pic:pic>
+              </a:graphicData>
+            </a:graphic>
+          </wp:inline>
+        </w:drawing>
+      </w:r>
+    </w:p>
+    <w:p>
+      <w:pPr>
+        <w:spacing w:after="120" w:before="40"/>
+        <w:jc w:val="center"/>
+      </w:pPr>
+      <w:r>
+        <w:rPr>
+          <w:rFonts w:ascii="Calibri" w:cs="Calibri" w:eastAsia="Calibri" w:hAnsi="Calibri"/>
+          <w:b/>
+          <w:bCs/>
+          <w:i/>
+          <w:iCs/>
+          <w:color w:val="475569"/>
+          <w:sz w:val="18"/>
+          <w:szCs w:val="18"/>
+        </w:rPr>
+        <w:t xml:space="preserve">Captura de Pantalla: Módulo de Constancias — Generación con Firma Criptográfica y Validación Ciudadana QR</w:t>
+      </w:r>
+    </w:p>
+    <w:p>
+      <w:pPr>
+        <w:pStyle w:val="ListParagraph"/>
+        <w:numPr>
+          <w:ilvl w:val="0"/>
+          <w:numId w:val="1"/>
+        </w:numPr>
+        <w:spacing w:after="60" w:before="40" w:line="260"/>
+      </w:pPr>
+      <w:r>
+        <w:rPr>
+          <w:rFonts w:ascii="Calibri" w:cs="Calibri" w:eastAsia="Calibri" w:hAnsi="Calibri"/>
+          <w:b/>
+          <w:bCs/>
+          <w:color w:val="0C2340"/>
+          <w:sz w:val="21"/>
+          <w:szCs w:val="21"/>
+        </w:rPr>
+        <w:t xml:space="preserve">Automatización Total: </w:t>
+      </w:r>
+      <w:r>
+        <w:rPr>
+          <w:rFonts w:ascii="Calibri" w:cs="Calibri" w:eastAsia="Calibri" w:hAnsi="Calibri"/>
+          <w:color w:val="1E293B"/>
+          <w:sz w:val="21"/>
+          <w:szCs w:val="21"/>
+        </w:rPr>
+        <w:t xml:space="preserve">Reducción del tiempo de emisión de días a menos de 5 segundos.</w:t>
+      </w:r>
+    </w:p>
+    <w:p>
+      <w:pPr>
+        <w:pStyle w:val="ListParagraph"/>
+        <w:numPr>
+          <w:ilvl w:val="0"/>
+          <w:numId w:val="1"/>
+        </w:numPr>
+        <w:spacing w:after="60" w:before="40" w:line="260"/>
+      </w:pPr>
+      <w:r>
+        <w:rPr>
+          <w:rFonts w:ascii="Calibri" w:cs="Calibri" w:eastAsia="Calibri" w:hAnsi="Calibri"/>
+          <w:b/>
+          <w:bCs/>
+          <w:color w:val="0C2340"/>
+          <w:sz w:val="21"/>
+          <w:szCs w:val="21"/>
+        </w:rPr>
+        <w:t xml:space="preserve">Validación Pública Móvil: </w:t>
+      </w:r>
+      <w:r>
+        <w:rPr>
+          <w:rFonts w:ascii="Calibri" w:cs="Calibri" w:eastAsia="Calibri" w:hAnsi="Calibri"/>
+          <w:color w:val="1E293B"/>
+          <w:sz w:val="21"/>
+          <w:szCs w:val="21"/>
+        </w:rPr>
+        <w:t xml:space="preserve">Cualquier entidad (bancos, embajadas) puede escanear el QR con su teléfono y comprobar la autenticidad al instante.</w:t>
+      </w:r>
+    </w:p>
+    <w:p>
+      <w:pPr>
+        <w:pStyle w:val="ListParagraph"/>
+        <w:numPr>
+          <w:ilvl w:val="0"/>
+          <w:numId w:val="1"/>
+        </w:numPr>
+        <w:spacing w:after="60" w:before="40" w:line="260"/>
+      </w:pPr>
+      <w:r>
+        <w:rPr>
+          <w:rFonts w:ascii="Calibri" w:cs="Calibri" w:eastAsia="Calibri" w:hAnsi="Calibri"/>
+          <w:b/>
+          <w:bCs/>
+          <w:color w:val="0C2340"/>
+          <w:sz w:val="21"/>
+          <w:szCs w:val="21"/>
+        </w:rPr>
+        <w:t xml:space="preserve">Trazabilidad Criptográfica: </w:t>
+      </w:r>
+      <w:r>
+        <w:rPr>
+          <w:rFonts w:ascii="Calibri" w:cs="Calibri" w:eastAsia="Calibri" w:hAnsi="Calibri"/>
+          <w:color w:val="1E293B"/>
+          <w:sz w:val="21"/>
+          <w:szCs w:val="21"/>
+        </w:rPr>
+        <w:t xml:space="preserve">Cada documento incluye un hash SHA-256 único registrado en la pista de auditoría.</w:t>
+      </w:r>
+    </w:p>
+    <w:p>
+      <w:pPr>
+        <w:pStyle w:val="Heading2"/>
+        <w:spacing w:after="120" w:before="240"/>
+        <w:rPr>
+          <w:rFonts w:ascii="Calibri" w:cs="Calibri" w:eastAsia="Calibri" w:hAnsi="Calibri"/>
+          <w:b/>
+          <w:bCs/>
+          <w:color w:val="1E3A8A"/>
+          <w:sz w:val="26"/>
+          <w:szCs w:val="26"/>
+        </w:rPr>
+      </w:pPr>
+      <w:r>
+        <w:t xml:space="preserve">Anexo 6: Módulo de Nóminas, Salarios y Compensaciones</w:t>
+      </w:r>
+    </w:p>
+    <w:p>
+      <w:pPr>
+        <w:spacing w:after="100" w:before="60" w:line="276"/>
+        <w:jc w:val="both"/>
+      </w:pPr>
+      <w:r>
+        <w:rPr>
+          <w:rFonts w:ascii="Calibri" w:cs="Calibri" w:eastAsia="Calibri" w:hAnsi="Calibri"/>
+          <w:b w:val="false"/>
+          <w:bCs w:val="false"/>
+          <w:i w:val="false"/>
+          <w:iCs w:val="false"/>
+          <w:color w:val="1E293B"/>
+          <w:sz w:val="21"/>
+          <w:szCs w:val="21"/>
+        </w:rPr>
+        <w:t xml:space="preserve">Motor de liquidación y consolidación de nóminas mensuales para personal permanente (011) y honorarios (029), con cálculo de deducciones y retenciones tributarias.</w:t>
+      </w:r>
+    </w:p>
+    <w:p>
+      <w:pPr>
+        <w:spacing w:after="60" w:before="200"/>
+        <w:jc w:val="center"/>
+      </w:pPr>
+      <w:r>
+        <w:drawing>
+          <wp:inline distT="0" distB="0" distL="0" distR="0">
+            <wp:extent cx="5334000" cy="3333750"/>
+            <wp:effectExtent t="0" r="0" b="0" l="0"/>
+            <wp:docPr id="12" name="" descr="" title=""/>
+            <wp:cNvGraphicFramePr>
+              <a:graphicFrameLocks xmlns:a="http://schemas.openxmlformats.org/drawingml/2006/main" noChangeAspect="1"/>
+            </wp:cNvGraphicFramePr>
+            <a:graphic xmlns:a="http://schemas.openxmlformats.org/drawingml/2006/main">
+              <a:graphicData uri="http://schemas.openxmlformats.org/drawingml/2006/picture">
+                <pic:pic xmlns:pic="http://schemas.openxmlformats.org/drawingml/2006/picture">
+                  <pic:nvPicPr>
+                    <pic:cNvPr id="0" name="" descr=""/>
+                    <pic:cNvPicPr>
+                      <a:picLocks noChangeAspect="1" noChangeArrowheads="1"/>
+                    </pic:cNvPicPr>
+                  </pic:nvPicPr>
+                  <pic:blipFill>
+                    <a:blip r:embed="rId20" cstate="none"/>
+                    <a:srcRect/>
+                    <a:stretch>
+                      <a:fillRect/>
+                    </a:stretch>
+                  </pic:blipFill>
+                  <pic:spPr bwMode="auto">
+                    <a:xfrm>
+                      <a:off x="0" y="0"/>
+                      <a:ext cx="5334000" cy="3333750"/>
+                    </a:xfrm>
+                    <a:prstGeom prst="rect">
+                      <a:avLst/>
+                    </a:prstGeom>
+                  </pic:spPr>
+                </pic:pic>
+              </a:graphicData>
+            </a:graphic>
+          </wp:inline>
+        </w:drawing>
+      </w:r>
+    </w:p>
+    <w:p>
+      <w:pPr>
+        <w:spacing w:after="120" w:before="40"/>
+        <w:jc w:val="center"/>
+      </w:pPr>
+      <w:r>
+        <w:rPr>
+          <w:rFonts w:ascii="Calibri" w:cs="Calibri" w:eastAsia="Calibri" w:hAnsi="Calibri"/>
+          <w:b/>
+          <w:bCs/>
+          <w:i/>
+          <w:iCs/>
+          <w:color w:val="475569"/>
+          <w:sz w:val="18"/>
+          <w:szCs w:val="18"/>
+        </w:rPr>
+        <w:t xml:space="preserve">Captura de Pantalla: Módulo de Nóminas — Consolidación de Pagos, Deducciones y Planillas Oficiales</w:t>
+      </w:r>
+    </w:p>
+    <w:p>
+      <w:pPr>
+        <w:pStyle w:val="ListParagraph"/>
+        <w:numPr>
+          <w:ilvl w:val="0"/>
+          <w:numId w:val="1"/>
+        </w:numPr>
+        <w:spacing w:after="60" w:before="40" w:line="260"/>
+      </w:pPr>
+      <w:r>
+        <w:rPr>
+          <w:rFonts w:ascii="Calibri" w:cs="Calibri" w:eastAsia="Calibri" w:hAnsi="Calibri"/>
+          <w:b/>
+          <w:bCs/>
+          <w:color w:val="0C2340"/>
+          <w:sz w:val="21"/>
+          <w:szCs w:val="21"/>
+        </w:rPr>
+        <w:t xml:space="preserve">Cálculo Normativo Automático: </w:t>
+      </w:r>
+      <w:r>
+        <w:rPr>
+          <w:rFonts w:ascii="Calibri" w:cs="Calibri" w:eastAsia="Calibri" w:hAnsi="Calibri"/>
+          <w:color w:val="1E293B"/>
+          <w:sz w:val="21"/>
+          <w:szCs w:val="21"/>
+        </w:rPr>
+        <w:t xml:space="preserve">Descuentos de IGSS, Montepío, retención SAT y bonificaciones de ley.</w:t>
+      </w:r>
+    </w:p>
+    <w:p>
+      <w:pPr>
+        <w:pStyle w:val="ListParagraph"/>
+        <w:numPr>
+          <w:ilvl w:val="0"/>
+          <w:numId w:val="1"/>
+        </w:numPr>
+        <w:spacing w:after="60" w:before="40" w:line="260"/>
+      </w:pPr>
+      <w:r>
+        <w:rPr>
+          <w:rFonts w:ascii="Calibri" w:cs="Calibri" w:eastAsia="Calibri" w:hAnsi="Calibri"/>
+          <w:b/>
+          <w:bCs/>
+          <w:color w:val="0C2340"/>
+          <w:sz w:val="21"/>
+          <w:szCs w:val="21"/>
+        </w:rPr>
+        <w:t xml:space="preserve">Generación de Boletas de Pago: </w:t>
+      </w:r>
+      <w:r>
+        <w:rPr>
+          <w:rFonts w:ascii="Calibri" w:cs="Calibri" w:eastAsia="Calibri" w:hAnsi="Calibri"/>
+          <w:color w:val="1E293B"/>
+          <w:sz w:val="21"/>
+          <w:szCs w:val="21"/>
+        </w:rPr>
+        <w:t xml:space="preserve">Disponibilización instantánea de recibos en el Portal del Colaborador.</w:t>
+      </w:r>
+    </w:p>
+    <w:p>
+      <w:pPr>
+        <w:pStyle w:val="ListParagraph"/>
+        <w:numPr>
+          <w:ilvl w:val="0"/>
+          <w:numId w:val="1"/>
+        </w:numPr>
+        <w:spacing w:after="60" w:before="40" w:line="260"/>
+      </w:pPr>
+      <w:r>
+        <w:rPr>
+          <w:rFonts w:ascii="Calibri" w:cs="Calibri" w:eastAsia="Calibri" w:hAnsi="Calibri"/>
+          <w:b/>
+          <w:bCs/>
+          <w:color w:val="0C2340"/>
+          <w:sz w:val="21"/>
+          <w:szCs w:val="21"/>
+        </w:rPr>
+        <w:t xml:space="preserve">Exportación Bancaria y Contable: </w:t>
+      </w:r>
+      <w:r>
+        <w:rPr>
+          <w:rFonts w:ascii="Calibri" w:cs="Calibri" w:eastAsia="Calibri" w:hAnsi="Calibri"/>
+          <w:color w:val="1E293B"/>
+          <w:sz w:val="21"/>
+          <w:szCs w:val="21"/>
+        </w:rPr>
+        <w:t xml:space="preserve">Generación de archivos planos para transferencias bancarias institucionales.</w:t>
+      </w:r>
+    </w:p>
+    <w:p>
+      <w:pPr>
+        <w:pStyle w:val="Heading2"/>
+        <w:spacing w:after="120" w:before="240"/>
+        <w:rPr>
+          <w:rFonts w:ascii="Calibri" w:cs="Calibri" w:eastAsia="Calibri" w:hAnsi="Calibri"/>
+          <w:b/>
+          <w:bCs/>
+          <w:color w:val="1E3A8A"/>
+          <w:sz w:val="26"/>
+          <w:szCs w:val="26"/>
+        </w:rPr>
+      </w:pPr>
+      <w:r>
+        <w:t xml:space="preserve">Anexo 7: Control de Asistencia y Marcajes Biométricos</w:t>
+      </w:r>
+    </w:p>
+    <w:p>
+      <w:pPr>
+        <w:spacing w:after="100" w:before="60" w:line="276"/>
+        <w:jc w:val="both"/>
+      </w:pPr>
+      <w:r>
+        <w:rPr>
+          <w:rFonts w:ascii="Calibri" w:cs="Calibri" w:eastAsia="Calibri" w:hAnsi="Calibri"/>
+          <w:b w:val="false"/>
+          <w:bCs w:val="false"/>
+          <w:i w:val="false"/>
+          <w:iCs w:val="false"/>
+          <w:color w:val="1E293B"/>
+          <w:sz w:val="21"/>
+          <w:szCs w:val="21"/>
+        </w:rPr>
+        <w:t xml:space="preserve">Registro diario de puntualidad y permanencia con integración a relojes biométricos, detección de omisiones de marca y consolidación de turnos.</w:t>
+      </w:r>
+    </w:p>
+    <w:p>
+      <w:pPr>
+        <w:spacing w:after="60" w:before="200"/>
+        <w:jc w:val="center"/>
+      </w:pPr>
+      <w:r>
+        <w:drawing>
+          <wp:inline distT="0" distB="0" distL="0" distR="0">
+            <wp:extent cx="5334000" cy="3333750"/>
+            <wp:effectExtent t="0" r="0" b="0" l="0"/>
+            <wp:docPr id="13" name="" descr="" title=""/>
+            <wp:cNvGraphicFramePr>
+              <a:graphicFrameLocks xmlns:a="http://schemas.openxmlformats.org/drawingml/2006/main" noChangeAspect="1"/>
+            </wp:cNvGraphicFramePr>
+            <a:graphic xmlns:a="http://schemas.openxmlformats.org/drawingml/2006/main">
+              <a:graphicData uri="http://schemas.openxmlformats.org/drawingml/2006/picture">
+                <pic:pic xmlns:pic="http://schemas.openxmlformats.org/drawingml/2006/picture">
+                  <pic:nvPicPr>
+                    <pic:cNvPr id="0" name="" descr=""/>
+                    <pic:cNvPicPr>
+                      <a:picLocks noChangeAspect="1" noChangeArrowheads="1"/>
+                    </pic:cNvPicPr>
+                  </pic:nvPicPr>
+                  <pic:blipFill>
+                    <a:blip r:embed="rId21" cstate="none"/>
+                    <a:srcRect/>
+                    <a:stretch>
+                      <a:fillRect/>
+                    </a:stretch>
+                  </pic:blipFill>
+                  <pic:spPr bwMode="auto">
+                    <a:xfrm>
+                      <a:off x="0" y="0"/>
+                      <a:ext cx="5334000" cy="3333750"/>
+                    </a:xfrm>
+                    <a:prstGeom prst="rect">
+                      <a:avLst/>
+                    </a:prstGeom>
+                  </pic:spPr>
+                </pic:pic>
+              </a:graphicData>
+            </a:graphic>
+          </wp:inline>
+        </w:drawing>
+      </w:r>
+    </w:p>
+    <w:p>
+      <w:pPr>
+        <w:spacing w:after="120" w:before="40"/>
+        <w:jc w:val="center"/>
+      </w:pPr>
+      <w:r>
+        <w:rPr>
+          <w:rFonts w:ascii="Calibri" w:cs="Calibri" w:eastAsia="Calibri" w:hAnsi="Calibri"/>
+          <w:b/>
+          <w:bCs/>
+          <w:i/>
+          <w:iCs/>
+          <w:color w:val="475569"/>
+          <w:sz w:val="18"/>
+          <w:szCs w:val="18"/>
+        </w:rPr>
+        <w:t xml:space="preserve">Captura de Pantalla: Control de Asistencia — Monitoreo de Marcajes Biométricos y Horarios Laborales</w:t>
+      </w:r>
+    </w:p>
+    <w:p>
+      <w:pPr>
+        <w:pStyle w:val="ListParagraph"/>
+        <w:numPr>
+          <w:ilvl w:val="0"/>
+          <w:numId w:val="1"/>
+        </w:numPr>
+        <w:spacing w:after="60" w:before="40" w:line="260"/>
+      </w:pPr>
+      <w:r>
+        <w:rPr>
+          <w:rFonts w:ascii="Calibri" w:cs="Calibri" w:eastAsia="Calibri" w:hAnsi="Calibri"/>
+          <w:b/>
+          <w:bCs/>
+          <w:color w:val="0C2340"/>
+          <w:sz w:val="21"/>
+          <w:szCs w:val="21"/>
+        </w:rPr>
+        <w:t xml:space="preserve">Registro en Tiempo Real: </w:t>
+      </w:r>
+      <w:r>
+        <w:rPr>
+          <w:rFonts w:ascii="Calibri" w:cs="Calibri" w:eastAsia="Calibri" w:hAnsi="Calibri"/>
+          <w:color w:val="1E293B"/>
+          <w:sz w:val="21"/>
+          <w:szCs w:val="21"/>
+        </w:rPr>
+        <w:t xml:space="preserve">Consolidación de entradas y salidas de colaboradores.</w:t>
+      </w:r>
+    </w:p>
+    <w:p>
+      <w:pPr>
+        <w:pStyle w:val="ListParagraph"/>
+        <w:numPr>
+          <w:ilvl w:val="0"/>
+          <w:numId w:val="1"/>
+        </w:numPr>
+        <w:spacing w:after="60" w:before="40" w:line="260"/>
+      </w:pPr>
+      <w:r>
+        <w:rPr>
+          <w:rFonts w:ascii="Calibri" w:cs="Calibri" w:eastAsia="Calibri" w:hAnsi="Calibri"/>
+          <w:b/>
+          <w:bCs/>
+          <w:color w:val="0C2340"/>
+          <w:sz w:val="21"/>
+          <w:szCs w:val="21"/>
+        </w:rPr>
+        <w:t xml:space="preserve">Justificación de Incidencias: </w:t>
+      </w:r>
+      <w:r>
+        <w:rPr>
+          <w:rFonts w:ascii="Calibri" w:cs="Calibri" w:eastAsia="Calibri" w:hAnsi="Calibri"/>
+          <w:color w:val="1E293B"/>
+          <w:sz w:val="21"/>
+          <w:szCs w:val="21"/>
+        </w:rPr>
+        <w:t xml:space="preserve">Vinculación inmediata con permisos médicos o comisiones autorizadas.</w:t>
+      </w:r>
+    </w:p>
+    <w:p>
+      <w:pPr>
+        <w:pStyle w:val="ListParagraph"/>
+        <w:numPr>
+          <w:ilvl w:val="0"/>
+          <w:numId w:val="1"/>
+        </w:numPr>
+        <w:spacing w:after="60" w:before="40" w:line="260"/>
+      </w:pPr>
+      <w:r>
+        <w:rPr>
+          <w:rFonts w:ascii="Calibri" w:cs="Calibri" w:eastAsia="Calibri" w:hAnsi="Calibri"/>
+          <w:b/>
+          <w:bCs/>
+          <w:color w:val="0C2340"/>
+          <w:sz w:val="21"/>
+          <w:szCs w:val="21"/>
+        </w:rPr>
+        <w:t xml:space="preserve">Reportes para Planilla: </w:t>
+      </w:r>
+      <w:r>
+        <w:rPr>
+          <w:rFonts w:ascii="Calibri" w:cs="Calibri" w:eastAsia="Calibri" w:hAnsi="Calibri"/>
+          <w:color w:val="1E293B"/>
+          <w:sz w:val="21"/>
+          <w:szCs w:val="21"/>
+        </w:rPr>
+        <w:t xml:space="preserve">Cálculo automatizado de tardanzas o ausencias justificadas e injustificadas.</w:t>
+      </w:r>
+    </w:p>
+    <w:p>
+      <w:pPr>
+        <w:pStyle w:val="Heading2"/>
+        <w:spacing w:after="120" w:before="240"/>
+        <w:rPr>
+          <w:rFonts w:ascii="Calibri" w:cs="Calibri" w:eastAsia="Calibri" w:hAnsi="Calibri"/>
+          <w:b/>
+          <w:bCs/>
+          <w:color w:val="1E3A8A"/>
+          <w:sz w:val="26"/>
+          <w:szCs w:val="26"/>
+        </w:rPr>
+      </w:pPr>
+      <w:r>
+        <w:t xml:space="preserve">Anexo 8: Gestión Automatizada de Vacaciones y Descansos</w:t>
+      </w:r>
+    </w:p>
+    <w:p>
+      <w:pPr>
+        <w:spacing w:after="100" w:before="60" w:line="276"/>
+        <w:jc w:val="both"/>
+      </w:pPr>
+      <w:r>
+        <w:rPr>
+          <w:rFonts w:ascii="Calibri" w:cs="Calibri" w:eastAsia="Calibri" w:hAnsi="Calibri"/>
+          <w:b w:val="false"/>
+          <w:bCs w:val="false"/>
+          <w:i w:val="false"/>
+          <w:iCs w:val="false"/>
+          <w:color w:val="1E293B"/>
+          <w:sz w:val="21"/>
+          <w:szCs w:val="21"/>
+        </w:rPr>
+        <w:t xml:space="preserve">Kardex digital individualizado que calcula los períodos acumulados de descanso conforme a la Ley de Servicio Civil y su reglamento.</w:t>
+      </w:r>
+    </w:p>
+    <w:p>
+      <w:pPr>
+        <w:spacing w:after="60" w:before="200"/>
+        <w:jc w:val="center"/>
+      </w:pPr>
+      <w:r>
+        <w:drawing>
+          <wp:inline distT="0" distB="0" distL="0" distR="0">
+            <wp:extent cx="5334000" cy="3333750"/>
+            <wp:effectExtent t="0" r="0" b="0" l="0"/>
+            <wp:docPr id="14" name="" descr="" title=""/>
+            <wp:cNvGraphicFramePr>
+              <a:graphicFrameLocks xmlns:a="http://schemas.openxmlformats.org/drawingml/2006/main" noChangeAspect="1"/>
+            </wp:cNvGraphicFramePr>
+            <a:graphic xmlns:a="http://schemas.openxmlformats.org/drawingml/2006/main">
+              <a:graphicData uri="http://schemas.openxmlformats.org/drawingml/2006/picture">
+                <pic:pic xmlns:pic="http://schemas.openxmlformats.org/drawingml/2006/picture">
+                  <pic:nvPicPr>
+                    <pic:cNvPr id="0" name="" descr=""/>
+                    <pic:cNvPicPr>
+                      <a:picLocks noChangeAspect="1" noChangeArrowheads="1"/>
+                    </pic:cNvPicPr>
+                  </pic:nvPicPr>
+                  <pic:blipFill>
+                    <a:blip r:embed="rId22" cstate="none"/>
+                    <a:srcRect/>
+                    <a:stretch>
+                      <a:fillRect/>
+                    </a:stretch>
+                  </pic:blipFill>
+                  <pic:spPr bwMode="auto">
+                    <a:xfrm>
+                      <a:off x="0" y="0"/>
+                      <a:ext cx="5334000" cy="3333750"/>
+                    </a:xfrm>
+                    <a:prstGeom prst="rect">
+                      <a:avLst/>
+                    </a:prstGeom>
+                  </pic:spPr>
+                </pic:pic>
+              </a:graphicData>
+            </a:graphic>
+          </wp:inline>
+        </w:drawing>
+      </w:r>
+    </w:p>
+    <w:p>
+      <w:pPr>
+        <w:spacing w:after="120" w:before="40"/>
+        <w:jc w:val="center"/>
+      </w:pPr>
+      <w:r>
+        <w:rPr>
+          <w:rFonts w:ascii="Calibri" w:cs="Calibri" w:eastAsia="Calibri" w:hAnsi="Calibri"/>
+          <w:b/>
+          <w:bCs/>
+          <w:i/>
+          <w:iCs/>
+          <w:color w:val="475569"/>
+          <w:sz w:val="18"/>
+          <w:szCs w:val="18"/>
+        </w:rPr>
+        <w:t xml:space="preserve">Captura de Pantalla: Módulo de Vacaciones — Kardex Digital y Solicitudes de Descanso</w:t>
+      </w:r>
+    </w:p>
+    <w:p>
+      <w:pPr>
+        <w:pStyle w:val="ListParagraph"/>
+        <w:numPr>
+          <w:ilvl w:val="0"/>
+          <w:numId w:val="1"/>
+        </w:numPr>
+        <w:spacing w:after="60" w:before="40" w:line="260"/>
+      </w:pPr>
+      <w:r>
+        <w:rPr>
+          <w:rFonts w:ascii="Calibri" w:cs="Calibri" w:eastAsia="Calibri" w:hAnsi="Calibri"/>
+          <w:b/>
+          <w:bCs/>
+          <w:color w:val="0C2340"/>
+          <w:sz w:val="21"/>
+          <w:szCs w:val="21"/>
+        </w:rPr>
+        <w:t xml:space="preserve">Cálculo Normativo de Días: </w:t>
+      </w:r>
+      <w:r>
+        <w:rPr>
+          <w:rFonts w:ascii="Calibri" w:cs="Calibri" w:eastAsia="Calibri" w:hAnsi="Calibri"/>
+          <w:color w:val="1E293B"/>
+          <w:sz w:val="21"/>
+          <w:szCs w:val="21"/>
+        </w:rPr>
+        <w:t xml:space="preserve">Exclusión automática de asuetos oficiales, feriados y fines de semana.</w:t>
+      </w:r>
+    </w:p>
+    <w:p>
+      <w:pPr>
+        <w:pStyle w:val="ListParagraph"/>
+        <w:numPr>
+          <w:ilvl w:val="0"/>
+          <w:numId w:val="1"/>
+        </w:numPr>
+        <w:spacing w:after="60" w:before="40" w:line="260"/>
+      </w:pPr>
+      <w:r>
+        <w:rPr>
+          <w:rFonts w:ascii="Calibri" w:cs="Calibri" w:eastAsia="Calibri" w:hAnsi="Calibri"/>
+          <w:b/>
+          <w:bCs/>
+          <w:color w:val="0C2340"/>
+          <w:sz w:val="21"/>
+          <w:szCs w:val="21"/>
+        </w:rPr>
+        <w:t xml:space="preserve">Flujo de Aprobación Jerárquica: </w:t>
+      </w:r>
+      <w:r>
+        <w:rPr>
+          <w:rFonts w:ascii="Calibri" w:cs="Calibri" w:eastAsia="Calibri" w:hAnsi="Calibri"/>
+          <w:color w:val="1E293B"/>
+          <w:sz w:val="21"/>
+          <w:szCs w:val="21"/>
+        </w:rPr>
+        <w:t xml:space="preserve">Autorización por jefatura de unidad y ratificación por la Jefatura de Recursos Humanos.</w:t>
+      </w:r>
+    </w:p>
+    <w:p>
+      <w:pPr>
+        <w:pStyle w:val="ListParagraph"/>
+        <w:numPr>
+          <w:ilvl w:val="0"/>
+          <w:numId w:val="1"/>
+        </w:numPr>
+        <w:spacing w:after="60" w:before="40" w:line="260"/>
+      </w:pPr>
+      <w:r>
+        <w:rPr>
+          <w:rFonts w:ascii="Calibri" w:cs="Calibri" w:eastAsia="Calibri" w:hAnsi="Calibri"/>
+          <w:b/>
+          <w:bCs/>
+          <w:color w:val="0C2340"/>
+          <w:sz w:val="21"/>
+          <w:szCs w:val="21"/>
+        </w:rPr>
+        <w:t xml:space="preserve">Prevención de Prescripción: </w:t>
+      </w:r>
+      <w:r>
+        <w:rPr>
+          <w:rFonts w:ascii="Calibri" w:cs="Calibri" w:eastAsia="Calibri" w:hAnsi="Calibri"/>
+          <w:color w:val="1E293B"/>
+          <w:sz w:val="21"/>
+          <w:szCs w:val="21"/>
+        </w:rPr>
+        <w:t xml:space="preserve">Alertas anticipadas para evitar acumulación excesiva de períodos.</w:t>
+      </w:r>
+    </w:p>
+    <w:p>
+      <w:pPr>
+        <w:pStyle w:val="Heading2"/>
+        <w:spacing w:after="120" w:before="240"/>
+        <w:rPr>
+          <w:rFonts w:ascii="Calibri" w:cs="Calibri" w:eastAsia="Calibri" w:hAnsi="Calibri"/>
+          <w:b/>
+          <w:bCs/>
+          <w:color w:val="1E3A8A"/>
+          <w:sz w:val="26"/>
+          <w:szCs w:val="26"/>
+        </w:rPr>
+      </w:pPr>
+      <w:r>
+        <w:t xml:space="preserve">Anexo 9: Módulo de Licencias, Permisos y Reposos Médicos</w:t>
+      </w:r>
+    </w:p>
+    <w:p>
+      <w:pPr>
+        <w:spacing w:after="100" w:before="60" w:line="276"/>
+        <w:jc w:val="both"/>
+      </w:pPr>
+      <w:r>
+        <w:rPr>
+          <w:rFonts w:ascii="Calibri" w:cs="Calibri" w:eastAsia="Calibri" w:hAnsi="Calibri"/>
+          <w:b w:val="false"/>
+          <w:bCs w:val="false"/>
+          <w:i w:val="false"/>
+          <w:iCs w:val="false"/>
+          <w:color w:val="1E293B"/>
+          <w:sz w:val="21"/>
+          <w:szCs w:val="21"/>
+        </w:rPr>
+        <w:t xml:space="preserve">Gestión de suspensiones de trabajo con y sin goce de salario, permisos por maternidad/paternidad, duelo, estudios y suspensiones del IGSS.</w:t>
+      </w:r>
+    </w:p>
+    <w:p>
+      <w:pPr>
+        <w:spacing w:after="60" w:before="200"/>
+        <w:jc w:val="center"/>
+      </w:pPr>
+      <w:r>
+        <w:drawing>
+          <wp:inline distT="0" distB="0" distL="0" distR="0">
+            <wp:extent cx="5334000" cy="3333750"/>
+            <wp:effectExtent t="0" r="0" b="0" l="0"/>
+            <wp:docPr id="15" name="" descr="" title=""/>
+            <wp:cNvGraphicFramePr>
+              <a:graphicFrameLocks xmlns:a="http://schemas.openxmlformats.org/drawingml/2006/main" noChangeAspect="1"/>
+            </wp:cNvGraphicFramePr>
+            <a:graphic xmlns:a="http://schemas.openxmlformats.org/drawingml/2006/main">
+              <a:graphicData uri="http://schemas.openxmlformats.org/drawingml/2006/picture">
+                <pic:pic xmlns:pic="http://schemas.openxmlformats.org/drawingml/2006/picture">
+                  <pic:nvPicPr>
+                    <pic:cNvPr id="0" name="" descr=""/>
+                    <pic:cNvPicPr>
+                      <a:picLocks noChangeAspect="1" noChangeArrowheads="1"/>
+                    </pic:cNvPicPr>
+                  </pic:nvPicPr>
+                  <pic:blipFill>
+                    <a:blip r:embed="rId23" cstate="none"/>
+                    <a:srcRect/>
+                    <a:stretch>
+                      <a:fillRect/>
+                    </a:stretch>
+                  </pic:blipFill>
+                  <pic:spPr bwMode="auto">
+                    <a:xfrm>
+                      <a:off x="0" y="0"/>
+                      <a:ext cx="5334000" cy="3333750"/>
+                    </a:xfrm>
+                    <a:prstGeom prst="rect">
+                      <a:avLst/>
+                    </a:prstGeom>
+                  </pic:spPr>
+                </pic:pic>
+              </a:graphicData>
+            </a:graphic>
+          </wp:inline>
+        </w:drawing>
+      </w:r>
+    </w:p>
+    <w:p>
+      <w:pPr>
+        <w:spacing w:after="120" w:before="40"/>
+        <w:jc w:val="center"/>
+      </w:pPr>
+      <w:r>
+        <w:rPr>
+          <w:rFonts w:ascii="Calibri" w:cs="Calibri" w:eastAsia="Calibri" w:hAnsi="Calibri"/>
+          <w:b/>
+          <w:bCs/>
+          <w:i/>
+          <w:iCs/>
+          <w:color w:val="475569"/>
+          <w:sz w:val="18"/>
+          <w:szCs w:val="18"/>
+        </w:rPr>
+        <w:t xml:space="preserve">Captura de Pantalla: Módulo de Licencias — Registro de Permisos Especiales y Suspensiones</w:t>
+      </w:r>
+    </w:p>
+    <w:p>
+      <w:pPr>
+        <w:pStyle w:val="ListParagraph"/>
+        <w:numPr>
+          <w:ilvl w:val="0"/>
+          <w:numId w:val="1"/>
+        </w:numPr>
+        <w:spacing w:after="60" w:before="40" w:line="260"/>
+      </w:pPr>
+      <w:r>
+        <w:rPr>
+          <w:rFonts w:ascii="Calibri" w:cs="Calibri" w:eastAsia="Calibri" w:hAnsi="Calibri"/>
+          <w:b/>
+          <w:bCs/>
+          <w:color w:val="0C2340"/>
+          <w:sz w:val="21"/>
+          <w:szCs w:val="21"/>
+        </w:rPr>
+        <w:t xml:space="preserve">Clasificación Legal Estricta: </w:t>
+      </w:r>
+      <w:r>
+        <w:rPr>
+          <w:rFonts w:ascii="Calibri" w:cs="Calibri" w:eastAsia="Calibri" w:hAnsi="Calibri"/>
+          <w:color w:val="1E293B"/>
+          <w:sz w:val="21"/>
+          <w:szCs w:val="21"/>
+        </w:rPr>
+        <w:t xml:space="preserve">Diferenciación entre permisos remunerados y no remunerados.</w:t>
+      </w:r>
+    </w:p>
+    <w:p>
+      <w:pPr>
+        <w:pStyle w:val="ListParagraph"/>
+        <w:numPr>
+          <w:ilvl w:val="0"/>
+          <w:numId w:val="1"/>
+        </w:numPr>
+        <w:spacing w:after="60" w:before="40" w:line="260"/>
+      </w:pPr>
+      <w:r>
+        <w:rPr>
+          <w:rFonts w:ascii="Calibri" w:cs="Calibri" w:eastAsia="Calibri" w:hAnsi="Calibri"/>
+          <w:b/>
+          <w:bCs/>
+          <w:color w:val="0C2340"/>
+          <w:sz w:val="21"/>
+          <w:szCs w:val="21"/>
+        </w:rPr>
+        <w:t xml:space="preserve">Adjunto de Justificaciones: </w:t>
+      </w:r>
+      <w:r>
+        <w:rPr>
+          <w:rFonts w:ascii="Calibri" w:cs="Calibri" w:eastAsia="Calibri" w:hAnsi="Calibri"/>
+          <w:color w:val="1E293B"/>
+          <w:sz w:val="21"/>
+          <w:szCs w:val="21"/>
+        </w:rPr>
+        <w:t xml:space="preserve">Carga de constancias médicas, boletas de citación o notas de duelo en el expediente.</w:t>
+      </w:r>
+    </w:p>
+    <w:p>
+      <w:pPr>
+        <w:pStyle w:val="ListParagraph"/>
+        <w:numPr>
+          <w:ilvl w:val="0"/>
+          <w:numId w:val="1"/>
+        </w:numPr>
+        <w:spacing w:after="60" w:before="40" w:line="260"/>
+      </w:pPr>
+      <w:r>
+        <w:rPr>
+          <w:rFonts w:ascii="Calibri" w:cs="Calibri" w:eastAsia="Calibri" w:hAnsi="Calibri"/>
+          <w:b/>
+          <w:bCs/>
+          <w:color w:val="0C2340"/>
+          <w:sz w:val="21"/>
+          <w:szCs w:val="21"/>
+        </w:rPr>
+        <w:t xml:space="preserve">Impacto Directo en Nómina: </w:t>
+      </w:r>
+      <w:r>
+        <w:rPr>
+          <w:rFonts w:ascii="Calibri" w:cs="Calibri" w:eastAsia="Calibri" w:hAnsi="Calibri"/>
+          <w:color w:val="1E293B"/>
+          <w:sz w:val="21"/>
+          <w:szCs w:val="21"/>
+        </w:rPr>
+        <w:t xml:space="preserve">Notificación automática al motor de pagos para ajustes proporcionales.</w:t>
+      </w:r>
+    </w:p>
+    <w:p>
+      <w:pPr>
+        <w:pStyle w:val="Heading2"/>
+        <w:spacing w:after="120" w:before="240"/>
+        <w:rPr>
+          <w:rFonts w:ascii="Calibri" w:cs="Calibri" w:eastAsia="Calibri" w:hAnsi="Calibri"/>
+          <w:b/>
+          <w:bCs/>
+          <w:color w:val="1E3A8A"/>
+          <w:sz w:val="26"/>
+          <w:szCs w:val="26"/>
+        </w:rPr>
+      </w:pPr>
+      <w:r>
+        <w:t xml:space="preserve">Anexo 10: Clínica Médica Institucional y Salud Ocupacional (SSO)</w:t>
+      </w:r>
+    </w:p>
+    <w:p>
+      <w:pPr>
+        <w:spacing w:after="100" w:before="60" w:line="276"/>
+        <w:jc w:val="both"/>
+      </w:pPr>
+      <w:r>
+        <w:rPr>
+          <w:rFonts w:ascii="Calibri" w:cs="Calibri" w:eastAsia="Calibri" w:hAnsi="Calibri"/>
+          <w:b w:val="false"/>
+          <w:bCs w:val="false"/>
+          <w:i w:val="false"/>
+          <w:iCs w:val="false"/>
+          <w:color w:val="1E293B"/>
+          <w:sz w:val="21"/>
+          <w:szCs w:val="21"/>
+        </w:rPr>
+        <w:t xml:space="preserve">Gestión de atenciones en la clínica interna de la SCSPR, control de reposos y cumplimiento del Reglamento de Salud y Seguridad Ocupacional (Acuerdo Gubernativo 229-2014).</w:t>
+      </w:r>
+    </w:p>
+    <w:p>
+      <w:pPr>
+        <w:spacing w:after="60" w:before="200"/>
+        <w:jc w:val="center"/>
+      </w:pPr>
+      <w:r>
+        <w:drawing>
+          <wp:inline distT="0" distB="0" distL="0" distR="0">
+            <wp:extent cx="5334000" cy="3333750"/>
+            <wp:effectExtent t="0" r="0" b="0" l="0"/>
+            <wp:docPr id="16" name="" descr="" title=""/>
+            <wp:cNvGraphicFramePr>
+              <a:graphicFrameLocks xmlns:a="http://schemas.openxmlformats.org/drawingml/2006/main" noChangeAspect="1"/>
+            </wp:cNvGraphicFramePr>
+            <a:graphic xmlns:a="http://schemas.openxmlformats.org/drawingml/2006/main">
+              <a:graphicData uri="http://schemas.openxmlformats.org/drawingml/2006/picture">
+                <pic:pic xmlns:pic="http://schemas.openxmlformats.org/drawingml/2006/picture">
+                  <pic:nvPicPr>
+                    <pic:cNvPr id="0" name="" descr=""/>
+                    <pic:cNvPicPr>
+                      <a:picLocks noChangeAspect="1" noChangeArrowheads="1"/>
+                    </pic:cNvPicPr>
+                  </pic:nvPicPr>
+                  <pic:blipFill>
+                    <a:blip r:embed="rId24" cstate="none"/>
+                    <a:srcRect/>
+                    <a:stretch>
+                      <a:fillRect/>
+                    </a:stretch>
+                  </pic:blipFill>
+                  <pic:spPr bwMode="auto">
+                    <a:xfrm>
+                      <a:off x="0" y="0"/>
+                      <a:ext cx="5334000" cy="3333750"/>
+                    </a:xfrm>
+                    <a:prstGeom prst="rect">
+                      <a:avLst/>
+                    </a:prstGeom>
+                  </pic:spPr>
+                </pic:pic>
+              </a:graphicData>
+            </a:graphic>
+          </wp:inline>
+        </w:drawing>
+      </w:r>
+    </w:p>
+    <w:p>
+      <w:pPr>
+        <w:spacing w:after="120" w:before="40"/>
+        <w:jc w:val="center"/>
+      </w:pPr>
+      <w:r>
+        <w:rPr>
+          <w:rFonts w:ascii="Calibri" w:cs="Calibri" w:eastAsia="Calibri" w:hAnsi="Calibri"/>
+          <w:b/>
+          <w:bCs/>
+          <w:i/>
+          <w:iCs/>
+          <w:color w:val="475569"/>
+          <w:sz w:val="18"/>
+          <w:szCs w:val="18"/>
+        </w:rPr>
+        <w:t xml:space="preserve">Captura de Pantalla: Clínica Médica y SSO — Expediente Clínico Confidencial y Control de Reposos</w:t>
+      </w:r>
+    </w:p>
+    <w:p>
+      <w:pPr>
+        <w:pStyle w:val="ListParagraph"/>
+        <w:numPr>
+          <w:ilvl w:val="0"/>
+          <w:numId w:val="1"/>
+        </w:numPr>
+        <w:spacing w:after="60" w:before="40" w:line="260"/>
+      </w:pPr>
+      <w:r>
+        <w:rPr>
+          <w:rFonts w:ascii="Calibri" w:cs="Calibri" w:eastAsia="Calibri" w:hAnsi="Calibri"/>
+          <w:b/>
+          <w:bCs/>
+          <w:color w:val="0C2340"/>
+          <w:sz w:val="21"/>
+          <w:szCs w:val="21"/>
+        </w:rPr>
+        <w:t xml:space="preserve">Confidencialidad Médica: </w:t>
+      </w:r>
+      <w:r>
+        <w:rPr>
+          <w:rFonts w:ascii="Calibri" w:cs="Calibri" w:eastAsia="Calibri" w:hAnsi="Calibri"/>
+          <w:color w:val="1E293B"/>
+          <w:sz w:val="21"/>
+          <w:szCs w:val="21"/>
+        </w:rPr>
+        <w:t xml:space="preserve">Aislamiento de diagnósticos clínicos restringidos exclusivamente al personal médico autorizado.</w:t>
+      </w:r>
+    </w:p>
+    <w:p>
+      <w:pPr>
+        <w:pStyle w:val="ListParagraph"/>
+        <w:numPr>
+          <w:ilvl w:val="0"/>
+          <w:numId w:val="1"/>
+        </w:numPr>
+        <w:spacing w:after="60" w:before="40" w:line="260"/>
+      </w:pPr>
+      <w:r>
+        <w:rPr>
+          <w:rFonts w:ascii="Calibri" w:cs="Calibri" w:eastAsia="Calibri" w:hAnsi="Calibri"/>
+          <w:b/>
+          <w:bCs/>
+          <w:color w:val="0C2340"/>
+          <w:sz w:val="21"/>
+          <w:szCs w:val="21"/>
+        </w:rPr>
+        <w:t xml:space="preserve">Control de Reposos: </w:t>
+      </w:r>
+      <w:r>
+        <w:rPr>
+          <w:rFonts w:ascii="Calibri" w:cs="Calibri" w:eastAsia="Calibri" w:hAnsi="Calibri"/>
+          <w:color w:val="1E293B"/>
+          <w:sz w:val="21"/>
+          <w:szCs w:val="21"/>
+        </w:rPr>
+        <w:t xml:space="preserve">Vinculación inmediata de certificados de reposo con el registro de asistencia institucional.</w:t>
+      </w:r>
+    </w:p>
+    <w:p>
+      <w:pPr>
+        <w:pStyle w:val="ListParagraph"/>
+        <w:numPr>
+          <w:ilvl w:val="0"/>
+          <w:numId w:val="1"/>
+        </w:numPr>
+        <w:spacing w:after="60" w:before="40" w:line="260"/>
+      </w:pPr>
+      <w:r>
+        <w:rPr>
+          <w:rFonts w:ascii="Calibri" w:cs="Calibri" w:eastAsia="Calibri" w:hAnsi="Calibri"/>
+          <w:b/>
+          <w:bCs/>
+          <w:color w:val="0C2340"/>
+          <w:sz w:val="21"/>
+          <w:szCs w:val="21"/>
+        </w:rPr>
+        <w:t xml:space="preserve">Inventario de Botiquín: </w:t>
+      </w:r>
+      <w:r>
+        <w:rPr>
+          <w:rFonts w:ascii="Calibri" w:cs="Calibri" w:eastAsia="Calibri" w:hAnsi="Calibri"/>
+          <w:color w:val="1E293B"/>
+          <w:sz w:val="21"/>
+          <w:szCs w:val="21"/>
+        </w:rPr>
+        <w:t xml:space="preserve">Monitoreo de insumos de primeros auxilios y medicamentos esenciales.</w:t>
+      </w:r>
+    </w:p>
+    <w:p>
+      <w:pPr>
+        <w:pStyle w:val="Heading2"/>
+        <w:spacing w:after="120" w:before="240"/>
+        <w:rPr>
+          <w:rFonts w:ascii="Calibri" w:cs="Calibri" w:eastAsia="Calibri" w:hAnsi="Calibri"/>
+          <w:b/>
+          <w:bCs/>
+          <w:color w:val="1E3A8A"/>
+          <w:sz w:val="26"/>
+          <w:szCs w:val="26"/>
+        </w:rPr>
+      </w:pPr>
+      <w:r>
+        <w:t xml:space="preserve">Anexo 11: Portal del Colaborador (Autogestión Self-Service)</w:t>
+      </w:r>
+    </w:p>
+    <w:p>
+      <w:pPr>
+        <w:spacing w:after="100" w:before="60" w:line="276"/>
+        <w:jc w:val="both"/>
+      </w:pPr>
+      <w:r>
+        <w:rPr>
+          <w:rFonts w:ascii="Calibri" w:cs="Calibri" w:eastAsia="Calibri" w:hAnsi="Calibri"/>
+          <w:b w:val="false"/>
+          <w:bCs w:val="false"/>
+          <w:i w:val="false"/>
+          <w:iCs w:val="false"/>
+          <w:color w:val="1E293B"/>
+          <w:sz w:val="21"/>
+          <w:szCs w:val="21"/>
+        </w:rPr>
+        <w:t xml:space="preserve">Espacio digital donde cada empleado de la Secretaría consulta su información laboral, boletas de pago, constancias emitidas y saldos de vacaciones sin acudir a ventanilla.</w:t>
+      </w:r>
+    </w:p>
+    <w:p>
+      <w:pPr>
+        <w:spacing w:after="60" w:before="200"/>
+        <w:jc w:val="center"/>
+      </w:pPr>
+      <w:r>
+        <w:drawing>
+          <wp:inline distT="0" distB="0" distL="0" distR="0">
+            <wp:extent cx="5334000" cy="3333750"/>
+            <wp:effectExtent t="0" r="0" b="0" l="0"/>
+            <wp:docPr id="17" name="" descr="" title=""/>
+            <wp:cNvGraphicFramePr>
+              <a:graphicFrameLocks xmlns:a="http://schemas.openxmlformats.org/drawingml/2006/main" noChangeAspect="1"/>
+            </wp:cNvGraphicFramePr>
+            <a:graphic xmlns:a="http://schemas.openxmlformats.org/drawingml/2006/main">
+              <a:graphicData uri="http://schemas.openxmlformats.org/drawingml/2006/picture">
+                <pic:pic xmlns:pic="http://schemas.openxmlformats.org/drawingml/2006/picture">
+                  <pic:nvPicPr>
+                    <pic:cNvPr id="0" name="" descr=""/>
+                    <pic:cNvPicPr>
+                      <a:picLocks noChangeAspect="1" noChangeArrowheads="1"/>
+                    </pic:cNvPicPr>
+                  </pic:nvPicPr>
+                  <pic:blipFill>
+                    <a:blip r:embed="rId25" cstate="none"/>
+                    <a:srcRect/>
+                    <a:stretch>
+                      <a:fillRect/>
+                    </a:stretch>
+                  </pic:blipFill>
+                  <pic:spPr bwMode="auto">
+                    <a:xfrm>
+                      <a:off x="0" y="0"/>
+                      <a:ext cx="5334000" cy="3333750"/>
+                    </a:xfrm>
+                    <a:prstGeom prst="rect">
+                      <a:avLst/>
+                    </a:prstGeom>
+                  </pic:spPr>
+                </pic:pic>
+              </a:graphicData>
+            </a:graphic>
+          </wp:inline>
+        </w:drawing>
+      </w:r>
+    </w:p>
+    <w:p>
+      <w:pPr>
+        <w:spacing w:after="120" w:before="40"/>
+        <w:jc w:val="center"/>
+      </w:pPr>
+      <w:r>
+        <w:rPr>
+          <w:rFonts w:ascii="Calibri" w:cs="Calibri" w:eastAsia="Calibri" w:hAnsi="Calibri"/>
+          <w:b/>
+          <w:bCs/>
+          <w:i/>
+          <w:iCs/>
+          <w:color w:val="475569"/>
+          <w:sz w:val="18"/>
+          <w:szCs w:val="18"/>
+        </w:rPr>
+        <w:t xml:space="preserve">Captura de Pantalla: Portal del Colaborador — Autoservicio de Boletas, Constancias y Marcajes</w:t>
+      </w:r>
+    </w:p>
+    <w:p>
+      <w:pPr>
+        <w:pStyle w:val="ListParagraph"/>
+        <w:numPr>
+          <w:ilvl w:val="0"/>
+          <w:numId w:val="1"/>
+        </w:numPr>
+        <w:spacing w:after="60" w:before="40" w:line="260"/>
+      </w:pPr>
+      <w:r>
+        <w:rPr>
+          <w:rFonts w:ascii="Calibri" w:cs="Calibri" w:eastAsia="Calibri" w:hAnsi="Calibri"/>
+          <w:b/>
+          <w:bCs/>
+          <w:color w:val="0C2340"/>
+          <w:sz w:val="21"/>
+          <w:szCs w:val="21"/>
+        </w:rPr>
+        <w:t xml:space="preserve">Acceso Seguro por CUI: </w:t>
+      </w:r>
+      <w:r>
+        <w:rPr>
+          <w:rFonts w:ascii="Calibri" w:cs="Calibri" w:eastAsia="Calibri" w:hAnsi="Calibri"/>
+          <w:color w:val="1E293B"/>
+          <w:sz w:val="21"/>
+          <w:szCs w:val="21"/>
+        </w:rPr>
+        <w:t xml:space="preserve">Ingreso autenticado utilizando el Código Único de Identificación del colaborador.</w:t>
+      </w:r>
+    </w:p>
+    <w:p>
+      <w:pPr>
+        <w:pStyle w:val="ListParagraph"/>
+        <w:numPr>
+          <w:ilvl w:val="0"/>
+          <w:numId w:val="1"/>
+        </w:numPr>
+        <w:spacing w:after="60" w:before="40" w:line="260"/>
+      </w:pPr>
+      <w:r>
+        <w:rPr>
+          <w:rFonts w:ascii="Calibri" w:cs="Calibri" w:eastAsia="Calibri" w:hAnsi="Calibri"/>
+          <w:b/>
+          <w:bCs/>
+          <w:color w:val="0C2340"/>
+          <w:sz w:val="21"/>
+          <w:szCs w:val="21"/>
+        </w:rPr>
+        <w:t xml:space="preserve">Descarga Autónoma: </w:t>
+      </w:r>
+      <w:r>
+        <w:rPr>
+          <w:rFonts w:ascii="Calibri" w:cs="Calibri" w:eastAsia="Calibri" w:hAnsi="Calibri"/>
+          <w:color w:val="1E293B"/>
+          <w:sz w:val="21"/>
+          <w:szCs w:val="21"/>
+        </w:rPr>
+        <w:t xml:space="preserve">Obtención de constancias laborales y comprobantes de nómina 24/7.</w:t>
+      </w:r>
+    </w:p>
+    <w:p>
+      <w:pPr>
+        <w:pStyle w:val="ListParagraph"/>
+        <w:numPr>
+          <w:ilvl w:val="0"/>
+          <w:numId w:val="1"/>
+        </w:numPr>
+        <w:spacing w:after="60" w:before="40" w:line="260"/>
+      </w:pPr>
+      <w:r>
+        <w:rPr>
+          <w:rFonts w:ascii="Calibri" w:cs="Calibri" w:eastAsia="Calibri" w:hAnsi="Calibri"/>
+          <w:b/>
+          <w:bCs/>
+          <w:color w:val="0C2340"/>
+          <w:sz w:val="21"/>
+          <w:szCs w:val="21"/>
+        </w:rPr>
+        <w:t xml:space="preserve">Descongestión de URH: </w:t>
+      </w:r>
+      <w:r>
+        <w:rPr>
+          <w:rFonts w:ascii="Calibri" w:cs="Calibri" w:eastAsia="Calibri" w:hAnsi="Calibri"/>
+          <w:color w:val="1E293B"/>
+          <w:sz w:val="21"/>
+          <w:szCs w:val="21"/>
+        </w:rPr>
+        <w:t xml:space="preserve">Eliminación de más del 80% de solicitudes rutinarias en ventanilla física.</w:t>
+      </w:r>
+    </w:p>
+    <w:p>
+      <w:pPr>
+        <w:pStyle w:val="Heading2"/>
+        <w:spacing w:after="120" w:before="240"/>
+        <w:rPr>
+          <w:rFonts w:ascii="Calibri" w:cs="Calibri" w:eastAsia="Calibri" w:hAnsi="Calibri"/>
+          <w:b/>
+          <w:bCs/>
+          <w:color w:val="1E3A8A"/>
+          <w:sz w:val="26"/>
+          <w:szCs w:val="26"/>
+        </w:rPr>
+      </w:pPr>
+      <w:r>
+        <w:t xml:space="preserve">Anexo 12: Motor Centralizado de Plantillas Oficiales Word (.docx)</w:t>
+      </w:r>
+    </w:p>
+    <w:p>
+      <w:pPr>
+        <w:spacing w:after="100" w:before="60" w:line="276"/>
+        <w:jc w:val="both"/>
+      </w:pPr>
+      <w:r>
+        <w:rPr>
+          <w:rFonts w:ascii="Calibri" w:cs="Calibri" w:eastAsia="Calibri" w:hAnsi="Calibri"/>
+          <w:b w:val="false"/>
+          <w:bCs w:val="false"/>
+          <w:i w:val="false"/>
+          <w:iCs w:val="false"/>
+          <w:color w:val="1E293B"/>
+          <w:sz w:val="21"/>
+          <w:szCs w:val="21"/>
+        </w:rPr>
+        <w:t xml:space="preserve">Repositorio institucional de formatos físicos con variables dinámicas del motor `easy-template-x`, garantizando consistencia legal y diseño homogéneo.</w:t>
+      </w:r>
+    </w:p>
+    <w:p>
+      <w:pPr>
+        <w:spacing w:after="60" w:before="200"/>
+        <w:jc w:val="center"/>
+      </w:pPr>
+      <w:r>
+        <w:drawing>
+          <wp:inline distT="0" distB="0" distL="0" distR="0">
+            <wp:extent cx="5334000" cy="3333750"/>
+            <wp:effectExtent t="0" r="0" b="0" l="0"/>
+            <wp:docPr id="18" name="" descr="" title=""/>
+            <wp:cNvGraphicFramePr>
+              <a:graphicFrameLocks xmlns:a="http://schemas.openxmlformats.org/drawingml/2006/main" noChangeAspect="1"/>
+            </wp:cNvGraphicFramePr>
+            <a:graphic xmlns:a="http://schemas.openxmlformats.org/drawingml/2006/main">
+              <a:graphicData uri="http://schemas.openxmlformats.org/drawingml/2006/picture">
+                <pic:pic xmlns:pic="http://schemas.openxmlformats.org/drawingml/2006/picture">
+                  <pic:nvPicPr>
+                    <pic:cNvPr id="0" name="" descr=""/>
+                    <pic:cNvPicPr>
+                      <a:picLocks noChangeAspect="1" noChangeArrowheads="1"/>
+                    </pic:cNvPicPr>
+                  </pic:nvPicPr>
+                  <pic:blipFill>
+                    <a:blip r:embed="rId26" cstate="none"/>
+                    <a:srcRect/>
+                    <a:stretch>
+                      <a:fillRect/>
+                    </a:stretch>
+                  </pic:blipFill>
+                  <pic:spPr bwMode="auto">
+                    <a:xfrm>
+                      <a:off x="0" y="0"/>
+                      <a:ext cx="5334000" cy="3333750"/>
+                    </a:xfrm>
+                    <a:prstGeom prst="rect">
+                      <a:avLst/>
+                    </a:prstGeom>
+                  </pic:spPr>
+                </pic:pic>
+              </a:graphicData>
+            </a:graphic>
+          </wp:inline>
+        </w:drawing>
+      </w:r>
+    </w:p>
+    <w:p>
+      <w:pPr>
+        <w:spacing w:after="120" w:before="40"/>
+        <w:jc w:val="center"/>
+      </w:pPr>
+      <w:r>
+        <w:rPr>
+          <w:rFonts w:ascii="Calibri" w:cs="Calibri" w:eastAsia="Calibri" w:hAnsi="Calibri"/>
+          <w:b/>
+          <w:bCs/>
+          <w:i/>
+          <w:iCs/>
+          <w:color w:val="475569"/>
+          <w:sz w:val="18"/>
+          <w:szCs w:val="18"/>
+        </w:rPr>
+        <w:t xml:space="preserve">Captura de Pantalla: Motor de Plantillas — Repositorio Oficial y Documentos Estandarizados Word</w:t>
+      </w:r>
+    </w:p>
+    <w:p>
+      <w:pPr>
+        <w:pStyle w:val="ListParagraph"/>
+        <w:numPr>
+          <w:ilvl w:val="0"/>
+          <w:numId w:val="1"/>
+        </w:numPr>
+        <w:spacing w:after="60" w:before="40" w:line="260"/>
+      </w:pPr>
+      <w:r>
+        <w:rPr>
+          <w:rFonts w:ascii="Calibri" w:cs="Calibri" w:eastAsia="Calibri" w:hAnsi="Calibri"/>
+          <w:b/>
+          <w:bCs/>
+          <w:color w:val="0C2340"/>
+          <w:sz w:val="21"/>
+          <w:szCs w:val="21"/>
+        </w:rPr>
+        <w:t xml:space="preserve">Variables Homologadas: </w:t>
+      </w:r>
+      <w:r>
+        <w:rPr>
+          <w:rFonts w:ascii="Calibri" w:cs="Calibri" w:eastAsia="Calibri" w:hAnsi="Calibri"/>
+          <w:color w:val="1E293B"/>
+          <w:sz w:val="21"/>
+          <w:szCs w:val="21"/>
+        </w:rPr>
+        <w:t xml:space="preserve">Uso estandarizado de etiquetas como `{{ NOMBRE_COMPLETO }}`, `{{ CUI }}`, `{{ PUESTO_NOMINAL }}`.</w:t>
+      </w:r>
+    </w:p>
+    <w:p>
+      <w:pPr>
+        <w:pStyle w:val="ListParagraph"/>
+        <w:numPr>
+          <w:ilvl w:val="0"/>
+          <w:numId w:val="1"/>
+        </w:numPr>
+        <w:spacing w:after="60" w:before="40" w:line="260"/>
+      </w:pPr>
+      <w:r>
+        <w:rPr>
+          <w:rFonts w:ascii="Calibri" w:cs="Calibri" w:eastAsia="Calibri" w:hAnsi="Calibri"/>
+          <w:b/>
+          <w:bCs/>
+          <w:color w:val="0C2340"/>
+          <w:sz w:val="21"/>
+          <w:szCs w:val="21"/>
+        </w:rPr>
+        <w:t xml:space="preserve">Formatos Oficiales por Área: </w:t>
+      </w:r>
+      <w:r>
+        <w:rPr>
+          <w:rFonts w:ascii="Calibri" w:cs="Calibri" w:eastAsia="Calibri" w:hAnsi="Calibri"/>
+          <w:color w:val="1E293B"/>
+          <w:sz w:val="21"/>
+          <w:szCs w:val="21"/>
+        </w:rPr>
+        <w:t xml:space="preserve">Plantillas específicas para Monitoreo de Personal, Nóminas y Acciones de Personal.</w:t>
+      </w:r>
+    </w:p>
+    <w:p>
+      <w:pPr>
+        <w:pStyle w:val="ListParagraph"/>
+        <w:numPr>
+          <w:ilvl w:val="0"/>
+          <w:numId w:val="1"/>
+        </w:numPr>
+        <w:spacing w:after="60" w:before="40" w:line="260"/>
+      </w:pPr>
+      <w:r>
+        <w:rPr>
+          <w:rFonts w:ascii="Calibri" w:cs="Calibri" w:eastAsia="Calibri" w:hAnsi="Calibri"/>
+          <w:b/>
+          <w:bCs/>
+          <w:color w:val="0C2340"/>
+          <w:sz w:val="21"/>
+          <w:szCs w:val="21"/>
+        </w:rPr>
+        <w:t xml:space="preserve">Descarga y Edición Controlada: </w:t>
+      </w:r>
+      <w:r>
+        <w:rPr>
+          <w:rFonts w:ascii="Calibri" w:cs="Calibri" w:eastAsia="Calibri" w:hAnsi="Calibri"/>
+          <w:color w:val="1E293B"/>
+          <w:sz w:val="21"/>
+          <w:szCs w:val="21"/>
+        </w:rPr>
+        <w:t xml:space="preserve">Versionado centralizado que impide la circulación de formatos obsoletos.</w:t>
+      </w:r>
+    </w:p>
+    <w:p>
+      <w:pPr>
+        <w:pStyle w:val="Heading2"/>
+        <w:spacing w:after="120" w:before="240"/>
+        <w:rPr>
+          <w:rFonts w:ascii="Calibri" w:cs="Calibri" w:eastAsia="Calibri" w:hAnsi="Calibri"/>
+          <w:b/>
+          <w:bCs/>
+          <w:color w:val="1E3A8A"/>
+          <w:sz w:val="26"/>
+          <w:szCs w:val="26"/>
+        </w:rPr>
+      </w:pPr>
+      <w:r>
+        <w:t xml:space="preserve">Anexo 13: Tablero Ejecutivo de Métricas de RRHH y Transparencia LAIP</w:t>
+      </w:r>
+    </w:p>
+    <w:p>
+      <w:pPr>
+        <w:spacing w:after="100" w:before="60" w:line="276"/>
+        <w:jc w:val="both"/>
+      </w:pPr>
+      <w:r>
+        <w:rPr>
+          <w:rFonts w:ascii="Calibri" w:cs="Calibri" w:eastAsia="Calibri" w:hAnsi="Calibri"/>
+          <w:b w:val="false"/>
+          <w:bCs w:val="false"/>
+          <w:i w:val="false"/>
+          <w:iCs w:val="false"/>
+          <w:color w:val="1E293B"/>
+          <w:sz w:val="21"/>
+          <w:szCs w:val="21"/>
+        </w:rPr>
+        <w:t xml:space="preserve">Panel directivo con indicadores agregados de distribución de personal por renglón presupuestario, pirámide de antigüedad y generación de reportes para el Artículo 10 de la LAIP.</w:t>
+      </w:r>
+    </w:p>
+    <w:p>
+      <w:pPr>
+        <w:spacing w:after="60" w:before="200"/>
+        <w:jc w:val="center"/>
+      </w:pPr>
+      <w:r>
+        <w:drawing>
+          <wp:inline distT="0" distB="0" distL="0" distR="0">
+            <wp:extent cx="5334000" cy="3333750"/>
+            <wp:effectExtent t="0" r="0" b="0" l="0"/>
+            <wp:docPr id="19" name="" descr="" title=""/>
+            <wp:cNvGraphicFramePr>
+              <a:graphicFrameLocks xmlns:a="http://schemas.openxmlformats.org/drawingml/2006/main" noChangeAspect="1"/>
+            </wp:cNvGraphicFramePr>
+            <a:graphic xmlns:a="http://schemas.openxmlformats.org/drawingml/2006/main">
+              <a:graphicData uri="http://schemas.openxmlformats.org/drawingml/2006/picture">
+                <pic:pic xmlns:pic="http://schemas.openxmlformats.org/drawingml/2006/picture">
+                  <pic:nvPicPr>
+                    <pic:cNvPr id="0" name="" descr=""/>
+                    <pic:cNvPicPr>
+                      <a:picLocks noChangeAspect="1" noChangeArrowheads="1"/>
+                    </pic:cNvPicPr>
+                  </pic:nvPicPr>
+                  <pic:blipFill>
+                    <a:blip r:embed="rId27" cstate="none"/>
+                    <a:srcRect/>
+                    <a:stretch>
+                      <a:fillRect/>
+                    </a:stretch>
+                  </pic:blipFill>
+                  <pic:spPr bwMode="auto">
+                    <a:xfrm>
+                      <a:off x="0" y="0"/>
+                      <a:ext cx="5334000" cy="3333750"/>
+                    </a:xfrm>
+                    <a:prstGeom prst="rect">
+                      <a:avLst/>
+                    </a:prstGeom>
+                  </pic:spPr>
+                </pic:pic>
+              </a:graphicData>
+            </a:graphic>
+          </wp:inline>
+        </w:drawing>
+      </w:r>
+    </w:p>
+    <w:p>
+      <w:pPr>
+        <w:spacing w:after="120" w:before="40"/>
+        <w:jc w:val="center"/>
+      </w:pPr>
+      <w:r>
+        <w:rPr>
+          <w:rFonts w:ascii="Calibri" w:cs="Calibri" w:eastAsia="Calibri" w:hAnsi="Calibri"/>
+          <w:b/>
+          <w:bCs/>
+          <w:i/>
+          <w:iCs/>
+          <w:color w:val="475569"/>
+          <w:sz w:val="18"/>
+          <w:szCs w:val="18"/>
+        </w:rPr>
+        <w:t xml:space="preserve">Captura de Pantalla: Tablero Ejecutivo — Indicadores Clave de Recursos Humanos y Reportes LAIP</w:t>
+      </w:r>
+    </w:p>
+    <w:p>
+      <w:pPr>
+        <w:pStyle w:val="ListParagraph"/>
+        <w:numPr>
+          <w:ilvl w:val="0"/>
+          <w:numId w:val="1"/>
+        </w:numPr>
+        <w:spacing w:after="60" w:before="40" w:line="260"/>
+      </w:pPr>
+      <w:r>
+        <w:rPr>
+          <w:rFonts w:ascii="Calibri" w:cs="Calibri" w:eastAsia="Calibri" w:hAnsi="Calibri"/>
+          <w:b/>
+          <w:bCs/>
+          <w:color w:val="0C2340"/>
+          <w:sz w:val="21"/>
+          <w:szCs w:val="21"/>
+        </w:rPr>
+        <w:t xml:space="preserve">Visión Panorámica Directiva: </w:t>
+      </w:r>
+      <w:r>
+        <w:rPr>
+          <w:rFonts w:ascii="Calibri" w:cs="Calibri" w:eastAsia="Calibri" w:hAnsi="Calibri"/>
+          <w:color w:val="1E293B"/>
+          <w:sz w:val="21"/>
+          <w:szCs w:val="21"/>
+        </w:rPr>
+        <w:t xml:space="preserve">Monitoreo en tiempo real de la dotación y masa salarial de la Secretaría.</w:t>
+      </w:r>
+    </w:p>
+    <w:p>
+      <w:pPr>
+        <w:pStyle w:val="ListParagraph"/>
+        <w:numPr>
+          <w:ilvl w:val="0"/>
+          <w:numId w:val="1"/>
+        </w:numPr>
+        <w:spacing w:after="60" w:before="40" w:line="260"/>
+      </w:pPr>
+      <w:r>
+        <w:rPr>
+          <w:rFonts w:ascii="Calibri" w:cs="Calibri" w:eastAsia="Calibri" w:hAnsi="Calibri"/>
+          <w:b/>
+          <w:bCs/>
+          <w:color w:val="0C2340"/>
+          <w:sz w:val="21"/>
+          <w:szCs w:val="21"/>
+        </w:rPr>
+        <w:t xml:space="preserve">Transparencia Institucional: </w:t>
+      </w:r>
+      <w:r>
+        <w:rPr>
+          <w:rFonts w:ascii="Calibri" w:cs="Calibri" w:eastAsia="Calibri" w:hAnsi="Calibri"/>
+          <w:color w:val="1E293B"/>
+          <w:sz w:val="21"/>
+          <w:szCs w:val="21"/>
+        </w:rPr>
+        <w:t xml:space="preserve">Consolidación de reportes listos para publicación en el portal de Información Pública de Oficio.</w:t>
+      </w:r>
+    </w:p>
+    <w:p>
+      <w:pPr>
+        <w:pStyle w:val="ListParagraph"/>
+        <w:numPr>
+          <w:ilvl w:val="0"/>
+          <w:numId w:val="1"/>
+        </w:numPr>
+        <w:spacing w:after="60" w:before="40" w:line="260"/>
+      </w:pPr>
+      <w:r>
+        <w:rPr>
+          <w:rFonts w:ascii="Calibri" w:cs="Calibri" w:eastAsia="Calibri" w:hAnsi="Calibri"/>
+          <w:b/>
+          <w:bCs/>
+          <w:color w:val="0C2340"/>
+          <w:sz w:val="21"/>
+          <w:szCs w:val="21"/>
+        </w:rPr>
+        <w:t xml:space="preserve">Toma de Decisiones Estratégica: </w:t>
+      </w:r>
+      <w:r>
+        <w:rPr>
+          <w:rFonts w:ascii="Calibri" w:cs="Calibri" w:eastAsia="Calibri" w:hAnsi="Calibri"/>
+          <w:color w:val="1E293B"/>
+          <w:sz w:val="21"/>
+          <w:szCs w:val="21"/>
+        </w:rPr>
+        <w:t xml:space="preserve">Identificación oportuna de vencimientos de contratos y proyecciones de gasto.</w:t>
       </w:r>
     </w:p>
     <w:p>

</xml_diff>